<commit_message>
Api Router & Dependency_injection codes
</commit_message>
<xml_diff>
--- a/Documentation/Section14c_______________-PROJECT___1__________--FASTNOTES.docx
+++ b/Documentation/Section14c_______________-PROJECT___1__________--FASTNOTES.docx
@@ -5541,7 +5541,7 @@
           <w:szCs w:val="24"/>
         </w:rPr>
         <w:pict>
-          <v:rect id="_x0000_i1035" style="width:0;height:1.5pt" o:hralign="center" o:hrstd="t" o:hr="t" fillcolor="#a0a0a0" stroked="f"/>
+          <v:rect id="_x0000_i1030" style="width:0;height:1.5pt" o:hralign="center" o:hrstd="t" o:hr="t" fillcolor="#a0a0a0" stroked="f"/>
         </w:pict>
       </w:r>
     </w:p>
@@ -11376,7 +11376,7 @@
           <w:szCs w:val="24"/>
         </w:rPr>
         <w:pict>
-          <v:rect id="_x0000_i1036" style="width:0;height:1.5pt" o:hralign="center" o:hrstd="t" o:hr="t" fillcolor="#a0a0a0" stroked="f"/>
+          <v:rect id="_x0000_i1031" style="width:0;height:1.5pt" o:hralign="center" o:hrstd="t" o:hr="t" fillcolor="#a0a0a0" stroked="f"/>
         </w:pict>
       </w:r>
     </w:p>
@@ -11773,7 +11773,7 @@
           <w:szCs w:val="24"/>
         </w:rPr>
         <w:pict>
-          <v:rect id="_x0000_i1037" style="width:0;height:1.5pt" o:hralign="center" o:hrstd="t" o:hr="t" fillcolor="#a0a0a0" stroked="f"/>
+          <v:rect id="_x0000_i1032" style="width:0;height:1.5pt" o:hralign="center" o:hrstd="t" o:hr="t" fillcolor="#a0a0a0" stroked="f"/>
         </w:pict>
       </w:r>
     </w:p>
@@ -12052,7 +12052,7 @@
           <w:szCs w:val="24"/>
         </w:rPr>
         <w:pict>
-          <v:rect id="_x0000_i1038" style="width:0;height:1.5pt" o:hralign="center" o:hrstd="t" o:hr="t" fillcolor="#a0a0a0" stroked="f"/>
+          <v:rect id="_x0000_i1033" style="width:0;height:1.5pt" o:hralign="center" o:hrstd="t" o:hr="t" fillcolor="#a0a0a0" stroked="f"/>
         </w:pict>
       </w:r>
     </w:p>
@@ -12369,17 +12369,21 @@
       <w:r>
         <w:rPr>
           <w:rFonts w:ascii="Segoe UI Symbol" w:hAnsi="Segoe UI Symbol" w:cs="Segoe UI Symbol"/>
+          <w:highlight w:val="yellow"/>
         </w:rPr>
         <w:t>📘</w:t>
       </w:r>
       <w:r>
+        <w:rPr>
+          <w:highlight w:val="yellow"/>
+        </w:rPr>
         <w:t xml:space="preserve"> FastNotes V3 – Improve Database Session Handling (Production Pattern)</w:t>
       </w:r>
     </w:p>
     <w:p>
       <w:r>
         <w:pict>
-          <v:rect id="_x0000_i1058" style="width:0;height:1.5pt" o:hralign="center" o:hrstd="t" o:hr="t" fillcolor="#a0a0a0" stroked="f"/>
+          <v:rect id="_x0000_i1034" style="width:0;height:1.5pt" o:hralign="center" o:hrstd="t" o:hr="t" fillcolor="#a0a0a0" stroked="f"/>
         </w:pict>
       </w:r>
     </w:p>
@@ -12669,7 +12673,7 @@
     <w:p>
       <w:r>
         <w:pict>
-          <v:rect id="_x0000_i1059" style="width:0;height:1.5pt" o:hralign="center" o:hrstd="t" o:hr="t" fillcolor="#a0a0a0" stroked="f"/>
+          <v:rect id="_x0000_i1035" style="width:0;height:1.5pt" o:hralign="center" o:hrstd="t" o:hr="t" fillcolor="#a0a0a0" stroked="f"/>
         </w:pict>
       </w:r>
     </w:p>
@@ -12964,7 +12968,7 @@
     <w:p>
       <w:r>
         <w:pict>
-          <v:rect id="_x0000_i1060" style="width:0;height:1.5pt" o:hralign="center" o:hrstd="t" o:hr="t" fillcolor="#a0a0a0" stroked="f"/>
+          <v:rect id="_x0000_i1036" style="width:0;height:1.5pt" o:hralign="center" o:hrstd="t" o:hr="t" fillcolor="#a0a0a0" stroked="f"/>
         </w:pict>
       </w:r>
     </w:p>
@@ -13010,7 +13014,7 @@
     <w:p>
       <w:r>
         <w:pict>
-          <v:rect id="_x0000_i1061" style="width:0;height:1.5pt" o:hralign="center" o:hrstd="t" o:hr="t" fillcolor="#a0a0a0" stroked="f"/>
+          <v:rect id="_x0000_i1037" style="width:0;height:1.5pt" o:hralign="center" o:hrstd="t" o:hr="t" fillcolor="#a0a0a0" stroked="f"/>
         </w:pict>
       </w:r>
     </w:p>
@@ -13295,7 +13299,7 @@
     <w:p>
       <w:r>
         <w:pict>
-          <v:rect id="_x0000_i1062" style="width:0;height:1.5pt" o:hralign="center" o:hrstd="t" o:hr="t" fillcolor="#a0a0a0" stroked="f"/>
+          <v:rect id="_x0000_i1038" style="width:0;height:1.5pt" o:hralign="center" o:hrstd="t" o:hr="t" fillcolor="#a0a0a0" stroked="f"/>
         </w:pict>
       </w:r>
     </w:p>
@@ -14723,8 +14727,2580 @@
     </w:p>
     <w:p>
       <w:r>
+        <w:t>Updated config.py:</w:t>
+      </w:r>
+    </w:p>
+    <w:p>
+      <w:pPr>
+        <w:shd w:val="clear" w:color="auto" w:fill="1E1E1E"/>
+        <w:spacing w:after="0" w:line="285" w:lineRule="atLeast"/>
+        <w:rPr>
+          <w:rFonts w:ascii="Consolas" w:eastAsia="Times New Roman" w:hAnsi="Consolas" w:cs="Times New Roman"/>
+          <w:color w:val="D4D4D4"/>
+          <w:sz w:val="21"/>
+          <w:szCs w:val="21"/>
+        </w:rPr>
+      </w:pPr>
+      <w:r>
+        <w:rPr>
+          <w:rFonts w:ascii="Consolas" w:eastAsia="Times New Roman" w:hAnsi="Consolas" w:cs="Times New Roman"/>
+          <w:color w:val="C586C0"/>
+          <w:sz w:val="21"/>
+          <w:szCs w:val="21"/>
+        </w:rPr>
+        <w:t>from</w:t>
+      </w:r>
+      <w:r>
+        <w:rPr>
+          <w:rFonts w:ascii="Consolas" w:eastAsia="Times New Roman" w:hAnsi="Consolas" w:cs="Times New Roman"/>
+          <w:color w:val="D4D4D4"/>
+          <w:sz w:val="21"/>
+          <w:szCs w:val="21"/>
+        </w:rPr>
+        <w:t xml:space="preserve"> </w:t>
+      </w:r>
+      <w:r>
+        <w:rPr>
+          <w:rFonts w:ascii="Consolas" w:eastAsia="Times New Roman" w:hAnsi="Consolas" w:cs="Times New Roman"/>
+          <w:color w:val="4EC9B0"/>
+          <w:sz w:val="21"/>
+          <w:szCs w:val="21"/>
+        </w:rPr>
+        <w:t>sqlalchemy</w:t>
+      </w:r>
+      <w:r>
+        <w:rPr>
+          <w:rFonts w:ascii="Consolas" w:eastAsia="Times New Roman" w:hAnsi="Consolas" w:cs="Times New Roman"/>
+          <w:color w:val="D4D4D4"/>
+          <w:sz w:val="21"/>
+          <w:szCs w:val="21"/>
+        </w:rPr>
+        <w:t>.</w:t>
+      </w:r>
+      <w:r>
+        <w:rPr>
+          <w:rFonts w:ascii="Consolas" w:eastAsia="Times New Roman" w:hAnsi="Consolas" w:cs="Times New Roman"/>
+          <w:color w:val="4EC9B0"/>
+          <w:sz w:val="21"/>
+          <w:szCs w:val="21"/>
+        </w:rPr>
+        <w:t>ext</w:t>
+      </w:r>
+      <w:r>
+        <w:rPr>
+          <w:rFonts w:ascii="Consolas" w:eastAsia="Times New Roman" w:hAnsi="Consolas" w:cs="Times New Roman"/>
+          <w:color w:val="D4D4D4"/>
+          <w:sz w:val="21"/>
+          <w:szCs w:val="21"/>
+        </w:rPr>
+        <w:t>.</w:t>
+      </w:r>
+      <w:r>
+        <w:rPr>
+          <w:rFonts w:ascii="Consolas" w:eastAsia="Times New Roman" w:hAnsi="Consolas" w:cs="Times New Roman"/>
+          <w:color w:val="4EC9B0"/>
+          <w:sz w:val="21"/>
+          <w:szCs w:val="21"/>
+        </w:rPr>
+        <w:t>asyncio</w:t>
+      </w:r>
+      <w:r>
+        <w:rPr>
+          <w:rFonts w:ascii="Consolas" w:eastAsia="Times New Roman" w:hAnsi="Consolas" w:cs="Times New Roman"/>
+          <w:color w:val="D4D4D4"/>
+          <w:sz w:val="21"/>
+          <w:szCs w:val="21"/>
+        </w:rPr>
+        <w:t xml:space="preserve"> </w:t>
+      </w:r>
+      <w:r>
+        <w:rPr>
+          <w:rFonts w:ascii="Consolas" w:eastAsia="Times New Roman" w:hAnsi="Consolas" w:cs="Times New Roman"/>
+          <w:color w:val="C586C0"/>
+          <w:sz w:val="21"/>
+          <w:szCs w:val="21"/>
+        </w:rPr>
+        <w:t>import</w:t>
+      </w:r>
+      <w:r>
+        <w:rPr>
+          <w:rFonts w:ascii="Consolas" w:eastAsia="Times New Roman" w:hAnsi="Consolas" w:cs="Times New Roman"/>
+          <w:color w:val="D4D4D4"/>
+          <w:sz w:val="21"/>
+          <w:szCs w:val="21"/>
+        </w:rPr>
+        <w:t xml:space="preserve"> </w:t>
+      </w:r>
+      <w:r>
+        <w:rPr>
+          <w:rFonts w:ascii="Consolas" w:eastAsia="Times New Roman" w:hAnsi="Consolas" w:cs="Times New Roman"/>
+          <w:color w:val="DCDCAA"/>
+          <w:sz w:val="21"/>
+          <w:szCs w:val="21"/>
+        </w:rPr>
+        <w:t>create_async_engine</w:t>
+      </w:r>
+      <w:r>
+        <w:rPr>
+          <w:rFonts w:ascii="Consolas" w:eastAsia="Times New Roman" w:hAnsi="Consolas" w:cs="Times New Roman"/>
+          <w:color w:val="D4D4D4"/>
+          <w:sz w:val="21"/>
+          <w:szCs w:val="21"/>
+        </w:rPr>
+        <w:t xml:space="preserve">, </w:t>
+      </w:r>
+      <w:r>
+        <w:rPr>
+          <w:rFonts w:ascii="Consolas" w:eastAsia="Times New Roman" w:hAnsi="Consolas" w:cs="Times New Roman"/>
+          <w:color w:val="4EC9B0"/>
+          <w:sz w:val="21"/>
+          <w:szCs w:val="21"/>
+        </w:rPr>
+        <w:t>async_sessionmaker</w:t>
+      </w:r>
+      <w:r>
+        <w:rPr>
+          <w:rFonts w:ascii="Consolas" w:eastAsia="Times New Roman" w:hAnsi="Consolas" w:cs="Times New Roman"/>
+          <w:color w:val="D4D4D4"/>
+          <w:sz w:val="21"/>
+          <w:szCs w:val="21"/>
+        </w:rPr>
+        <w:t xml:space="preserve">, </w:t>
+      </w:r>
+      <w:r>
+        <w:rPr>
+          <w:rFonts w:ascii="Consolas" w:eastAsia="Times New Roman" w:hAnsi="Consolas" w:cs="Times New Roman"/>
+          <w:color w:val="4EC9B0"/>
+          <w:sz w:val="21"/>
+          <w:szCs w:val="21"/>
+        </w:rPr>
+        <w:t>AsyncSession</w:t>
+      </w:r>
+    </w:p>
+    <w:p>
+      <w:pPr>
+        <w:shd w:val="clear" w:color="auto" w:fill="1E1E1E"/>
+        <w:spacing w:after="0" w:line="285" w:lineRule="atLeast"/>
+        <w:rPr>
+          <w:rFonts w:ascii="Consolas" w:eastAsia="Times New Roman" w:hAnsi="Consolas" w:cs="Times New Roman"/>
+          <w:color w:val="D4D4D4"/>
+          <w:sz w:val="21"/>
+          <w:szCs w:val="21"/>
+        </w:rPr>
+      </w:pPr>
+    </w:p>
+    <w:p>
+      <w:pPr>
+        <w:shd w:val="clear" w:color="auto" w:fill="1E1E1E"/>
+        <w:spacing w:after="0" w:line="285" w:lineRule="atLeast"/>
+        <w:rPr>
+          <w:rFonts w:ascii="Consolas" w:eastAsia="Times New Roman" w:hAnsi="Consolas" w:cs="Times New Roman"/>
+          <w:color w:val="D4D4D4"/>
+          <w:sz w:val="21"/>
+          <w:szCs w:val="21"/>
+        </w:rPr>
+      </w:pPr>
+      <w:r>
+        <w:rPr>
+          <w:rFonts w:ascii="Consolas" w:eastAsia="Times New Roman" w:hAnsi="Consolas" w:cs="Times New Roman"/>
+          <w:color w:val="C586C0"/>
+          <w:sz w:val="21"/>
+          <w:szCs w:val="21"/>
+        </w:rPr>
+        <w:t>from</w:t>
+      </w:r>
+      <w:r>
+        <w:rPr>
+          <w:rFonts w:ascii="Consolas" w:eastAsia="Times New Roman" w:hAnsi="Consolas" w:cs="Times New Roman"/>
+          <w:color w:val="D4D4D4"/>
+          <w:sz w:val="21"/>
+          <w:szCs w:val="21"/>
+        </w:rPr>
+        <w:t xml:space="preserve"> </w:t>
+      </w:r>
+      <w:r>
+        <w:rPr>
+          <w:rFonts w:ascii="Consolas" w:eastAsia="Times New Roman" w:hAnsi="Consolas" w:cs="Times New Roman"/>
+          <w:color w:val="4EC9B0"/>
+          <w:sz w:val="21"/>
+          <w:szCs w:val="21"/>
+        </w:rPr>
+        <w:t>fastapi</w:t>
+      </w:r>
+      <w:r>
+        <w:rPr>
+          <w:rFonts w:ascii="Consolas" w:eastAsia="Times New Roman" w:hAnsi="Consolas" w:cs="Times New Roman"/>
+          <w:color w:val="D4D4D4"/>
+          <w:sz w:val="21"/>
+          <w:szCs w:val="21"/>
+        </w:rPr>
+        <w:t xml:space="preserve"> </w:t>
+      </w:r>
+      <w:r>
+        <w:rPr>
+          <w:rFonts w:ascii="Consolas" w:eastAsia="Times New Roman" w:hAnsi="Consolas" w:cs="Times New Roman"/>
+          <w:color w:val="C586C0"/>
+          <w:sz w:val="21"/>
+          <w:szCs w:val="21"/>
+        </w:rPr>
+        <w:t>import</w:t>
+      </w:r>
+      <w:r>
+        <w:rPr>
+          <w:rFonts w:ascii="Consolas" w:eastAsia="Times New Roman" w:hAnsi="Consolas" w:cs="Times New Roman"/>
+          <w:color w:val="D4D4D4"/>
+          <w:sz w:val="21"/>
+          <w:szCs w:val="21"/>
+        </w:rPr>
+        <w:t xml:space="preserve"> </w:t>
+      </w:r>
+      <w:r>
+        <w:rPr>
+          <w:rFonts w:ascii="Consolas" w:eastAsia="Times New Roman" w:hAnsi="Consolas" w:cs="Times New Roman"/>
+          <w:color w:val="DCDCAA"/>
+          <w:sz w:val="21"/>
+          <w:szCs w:val="21"/>
+        </w:rPr>
+        <w:t>Depends</w:t>
+      </w:r>
+    </w:p>
+    <w:p>
+      <w:pPr>
+        <w:shd w:val="clear" w:color="auto" w:fill="1E1E1E"/>
+        <w:spacing w:after="0" w:line="285" w:lineRule="atLeast"/>
+        <w:rPr>
+          <w:rFonts w:ascii="Consolas" w:eastAsia="Times New Roman" w:hAnsi="Consolas" w:cs="Times New Roman"/>
+          <w:color w:val="D4D4D4"/>
+          <w:sz w:val="21"/>
+          <w:szCs w:val="21"/>
+        </w:rPr>
+      </w:pPr>
+      <w:r>
+        <w:rPr>
+          <w:rFonts w:ascii="Consolas" w:eastAsia="Times New Roman" w:hAnsi="Consolas" w:cs="Times New Roman"/>
+          <w:color w:val="C586C0"/>
+          <w:sz w:val="21"/>
+          <w:szCs w:val="21"/>
+        </w:rPr>
+        <w:t>from</w:t>
+      </w:r>
+      <w:r>
+        <w:rPr>
+          <w:rFonts w:ascii="Consolas" w:eastAsia="Times New Roman" w:hAnsi="Consolas" w:cs="Times New Roman"/>
+          <w:color w:val="D4D4D4"/>
+          <w:sz w:val="21"/>
+          <w:szCs w:val="21"/>
+        </w:rPr>
+        <w:t xml:space="preserve"> </w:t>
+      </w:r>
+      <w:r>
+        <w:rPr>
+          <w:rFonts w:ascii="Consolas" w:eastAsia="Times New Roman" w:hAnsi="Consolas" w:cs="Times New Roman"/>
+          <w:color w:val="4EC9B0"/>
+          <w:sz w:val="21"/>
+          <w:szCs w:val="21"/>
+        </w:rPr>
+        <w:t>typing</w:t>
+      </w:r>
+      <w:r>
+        <w:rPr>
+          <w:rFonts w:ascii="Consolas" w:eastAsia="Times New Roman" w:hAnsi="Consolas" w:cs="Times New Roman"/>
+          <w:color w:val="D4D4D4"/>
+          <w:sz w:val="21"/>
+          <w:szCs w:val="21"/>
+        </w:rPr>
+        <w:t xml:space="preserve"> </w:t>
+      </w:r>
+      <w:r>
+        <w:rPr>
+          <w:rFonts w:ascii="Consolas" w:eastAsia="Times New Roman" w:hAnsi="Consolas" w:cs="Times New Roman"/>
+          <w:color w:val="C586C0"/>
+          <w:sz w:val="21"/>
+          <w:szCs w:val="21"/>
+        </w:rPr>
+        <w:t>import</w:t>
+      </w:r>
+      <w:r>
+        <w:rPr>
+          <w:rFonts w:ascii="Consolas" w:eastAsia="Times New Roman" w:hAnsi="Consolas" w:cs="Times New Roman"/>
+          <w:color w:val="D4D4D4"/>
+          <w:sz w:val="21"/>
+          <w:szCs w:val="21"/>
+        </w:rPr>
+        <w:t xml:space="preserve"> </w:t>
+      </w:r>
+      <w:r>
+        <w:rPr>
+          <w:rFonts w:ascii="Consolas" w:eastAsia="Times New Roman" w:hAnsi="Consolas" w:cs="Times New Roman"/>
+          <w:color w:val="4EC9B0"/>
+          <w:sz w:val="21"/>
+          <w:szCs w:val="21"/>
+        </w:rPr>
+        <w:t>Annotated</w:t>
+      </w:r>
+    </w:p>
+    <w:p>
+      <w:pPr>
+        <w:shd w:val="clear" w:color="auto" w:fill="1E1E1E"/>
+        <w:spacing w:after="240" w:line="285" w:lineRule="atLeast"/>
+        <w:rPr>
+          <w:rFonts w:ascii="Consolas" w:eastAsia="Times New Roman" w:hAnsi="Consolas" w:cs="Times New Roman"/>
+          <w:color w:val="D4D4D4"/>
+          <w:sz w:val="21"/>
+          <w:szCs w:val="21"/>
+        </w:rPr>
+      </w:pPr>
+    </w:p>
+    <w:p>
+      <w:pPr>
+        <w:shd w:val="clear" w:color="auto" w:fill="1E1E1E"/>
+        <w:spacing w:after="0" w:line="285" w:lineRule="atLeast"/>
+        <w:rPr>
+          <w:rFonts w:ascii="Consolas" w:eastAsia="Times New Roman" w:hAnsi="Consolas" w:cs="Times New Roman"/>
+          <w:color w:val="D4D4D4"/>
+          <w:sz w:val="21"/>
+          <w:szCs w:val="21"/>
+        </w:rPr>
+      </w:pPr>
+      <w:r>
+        <w:rPr>
+          <w:rFonts w:ascii="Consolas" w:eastAsia="Times New Roman" w:hAnsi="Consolas" w:cs="Times New Roman"/>
+          <w:color w:val="6A9955"/>
+          <w:sz w:val="21"/>
+          <w:szCs w:val="21"/>
+        </w:rPr>
+        <w:t xml:space="preserve"># For better routing </w:t>
+      </w:r>
+    </w:p>
+    <w:p>
+      <w:pPr>
+        <w:shd w:val="clear" w:color="auto" w:fill="1E1E1E"/>
+        <w:spacing w:after="0" w:line="285" w:lineRule="atLeast"/>
+        <w:rPr>
+          <w:rFonts w:ascii="Consolas" w:eastAsia="Times New Roman" w:hAnsi="Consolas" w:cs="Times New Roman"/>
+          <w:color w:val="D4D4D4"/>
+          <w:sz w:val="21"/>
+          <w:szCs w:val="21"/>
+        </w:rPr>
+      </w:pPr>
+      <w:r>
+        <w:rPr>
+          <w:rFonts w:ascii="Consolas" w:eastAsia="Times New Roman" w:hAnsi="Consolas" w:cs="Times New Roman"/>
+          <w:color w:val="C586C0"/>
+          <w:sz w:val="21"/>
+          <w:szCs w:val="21"/>
+        </w:rPr>
+        <w:t>import</w:t>
+      </w:r>
+      <w:r>
+        <w:rPr>
+          <w:rFonts w:ascii="Consolas" w:eastAsia="Times New Roman" w:hAnsi="Consolas" w:cs="Times New Roman"/>
+          <w:color w:val="D4D4D4"/>
+          <w:sz w:val="21"/>
+          <w:szCs w:val="21"/>
+        </w:rPr>
+        <w:t xml:space="preserve"> </w:t>
+      </w:r>
+      <w:r>
+        <w:rPr>
+          <w:rFonts w:ascii="Consolas" w:eastAsia="Times New Roman" w:hAnsi="Consolas" w:cs="Times New Roman"/>
+          <w:color w:val="4EC9B0"/>
+          <w:sz w:val="21"/>
+          <w:szCs w:val="21"/>
+        </w:rPr>
+        <w:t>os</w:t>
+      </w:r>
+      <w:r>
+        <w:rPr>
+          <w:rFonts w:ascii="Consolas" w:eastAsia="Times New Roman" w:hAnsi="Consolas" w:cs="Times New Roman"/>
+          <w:color w:val="D4D4D4"/>
+          <w:sz w:val="21"/>
+          <w:szCs w:val="21"/>
+        </w:rPr>
+        <w:t xml:space="preserve"> </w:t>
+      </w:r>
+    </w:p>
+    <w:p>
+      <w:pPr>
+        <w:shd w:val="clear" w:color="auto" w:fill="1E1E1E"/>
+        <w:spacing w:after="0" w:line="285" w:lineRule="atLeast"/>
+        <w:rPr>
+          <w:rFonts w:ascii="Consolas" w:eastAsia="Times New Roman" w:hAnsi="Consolas" w:cs="Times New Roman"/>
+          <w:color w:val="D4D4D4"/>
+          <w:sz w:val="21"/>
+          <w:szCs w:val="21"/>
+        </w:rPr>
+      </w:pPr>
+      <w:r>
+        <w:rPr>
+          <w:rFonts w:ascii="Consolas" w:eastAsia="Times New Roman" w:hAnsi="Consolas" w:cs="Times New Roman"/>
+          <w:color w:val="4FC1FF"/>
+          <w:sz w:val="21"/>
+          <w:szCs w:val="21"/>
+        </w:rPr>
+        <w:t>BASE_DIR</w:t>
+      </w:r>
+      <w:r>
+        <w:rPr>
+          <w:rFonts w:ascii="Consolas" w:eastAsia="Times New Roman" w:hAnsi="Consolas" w:cs="Times New Roman"/>
+          <w:color w:val="D4D4D4"/>
+          <w:sz w:val="21"/>
+          <w:szCs w:val="21"/>
+        </w:rPr>
+        <w:t xml:space="preserve"> = </w:t>
+      </w:r>
+      <w:r>
+        <w:rPr>
+          <w:rFonts w:ascii="Consolas" w:eastAsia="Times New Roman" w:hAnsi="Consolas" w:cs="Times New Roman"/>
+          <w:color w:val="4EC9B0"/>
+          <w:sz w:val="21"/>
+          <w:szCs w:val="21"/>
+        </w:rPr>
+        <w:t>os</w:t>
+      </w:r>
+      <w:r>
+        <w:rPr>
+          <w:rFonts w:ascii="Consolas" w:eastAsia="Times New Roman" w:hAnsi="Consolas" w:cs="Times New Roman"/>
+          <w:color w:val="D4D4D4"/>
+          <w:sz w:val="21"/>
+          <w:szCs w:val="21"/>
+        </w:rPr>
+        <w:t>.</w:t>
+      </w:r>
+      <w:r>
+        <w:rPr>
+          <w:rFonts w:ascii="Consolas" w:eastAsia="Times New Roman" w:hAnsi="Consolas" w:cs="Times New Roman"/>
+          <w:color w:val="4EC9B0"/>
+          <w:sz w:val="21"/>
+          <w:szCs w:val="21"/>
+        </w:rPr>
+        <w:t>path</w:t>
+      </w:r>
+      <w:r>
+        <w:rPr>
+          <w:rFonts w:ascii="Consolas" w:eastAsia="Times New Roman" w:hAnsi="Consolas" w:cs="Times New Roman"/>
+          <w:color w:val="D4D4D4"/>
+          <w:sz w:val="21"/>
+          <w:szCs w:val="21"/>
+        </w:rPr>
+        <w:t>.</w:t>
+      </w:r>
+      <w:r>
+        <w:rPr>
+          <w:rFonts w:ascii="Consolas" w:eastAsia="Times New Roman" w:hAnsi="Consolas" w:cs="Times New Roman"/>
+          <w:color w:val="DCDCAA"/>
+          <w:sz w:val="21"/>
+          <w:szCs w:val="21"/>
+        </w:rPr>
+        <w:t>dirname</w:t>
+      </w:r>
+      <w:r>
+        <w:rPr>
+          <w:rFonts w:ascii="Consolas" w:eastAsia="Times New Roman" w:hAnsi="Consolas" w:cs="Times New Roman"/>
+          <w:color w:val="D4D4D4"/>
+          <w:sz w:val="21"/>
+          <w:szCs w:val="21"/>
+        </w:rPr>
+        <w:t>(</w:t>
+      </w:r>
+      <w:r>
+        <w:rPr>
+          <w:rFonts w:ascii="Consolas" w:eastAsia="Times New Roman" w:hAnsi="Consolas" w:cs="Times New Roman"/>
+          <w:color w:val="4EC9B0"/>
+          <w:sz w:val="21"/>
+          <w:szCs w:val="21"/>
+        </w:rPr>
+        <w:t>os</w:t>
+      </w:r>
+      <w:r>
+        <w:rPr>
+          <w:rFonts w:ascii="Consolas" w:eastAsia="Times New Roman" w:hAnsi="Consolas" w:cs="Times New Roman"/>
+          <w:color w:val="D4D4D4"/>
+          <w:sz w:val="21"/>
+          <w:szCs w:val="21"/>
+        </w:rPr>
+        <w:t>.</w:t>
+      </w:r>
+      <w:r>
+        <w:rPr>
+          <w:rFonts w:ascii="Consolas" w:eastAsia="Times New Roman" w:hAnsi="Consolas" w:cs="Times New Roman"/>
+          <w:color w:val="4EC9B0"/>
+          <w:sz w:val="21"/>
+          <w:szCs w:val="21"/>
+        </w:rPr>
+        <w:t>path</w:t>
+      </w:r>
+      <w:r>
+        <w:rPr>
+          <w:rFonts w:ascii="Consolas" w:eastAsia="Times New Roman" w:hAnsi="Consolas" w:cs="Times New Roman"/>
+          <w:color w:val="D4D4D4"/>
+          <w:sz w:val="21"/>
+          <w:szCs w:val="21"/>
+        </w:rPr>
+        <w:t>.</w:t>
+      </w:r>
+      <w:r>
+        <w:rPr>
+          <w:rFonts w:ascii="Consolas" w:eastAsia="Times New Roman" w:hAnsi="Consolas" w:cs="Times New Roman"/>
+          <w:color w:val="DCDCAA"/>
+          <w:sz w:val="21"/>
+          <w:szCs w:val="21"/>
+        </w:rPr>
+        <w:t>dirname</w:t>
+      </w:r>
+      <w:r>
+        <w:rPr>
+          <w:rFonts w:ascii="Consolas" w:eastAsia="Times New Roman" w:hAnsi="Consolas" w:cs="Times New Roman"/>
+          <w:color w:val="D4D4D4"/>
+          <w:sz w:val="21"/>
+          <w:szCs w:val="21"/>
+        </w:rPr>
+        <w:t>(</w:t>
+      </w:r>
+      <w:r>
+        <w:rPr>
+          <w:rFonts w:ascii="Consolas" w:eastAsia="Times New Roman" w:hAnsi="Consolas" w:cs="Times New Roman"/>
+          <w:color w:val="4EC9B0"/>
+          <w:sz w:val="21"/>
+          <w:szCs w:val="21"/>
+        </w:rPr>
+        <w:t>os</w:t>
+      </w:r>
+      <w:r>
+        <w:rPr>
+          <w:rFonts w:ascii="Consolas" w:eastAsia="Times New Roman" w:hAnsi="Consolas" w:cs="Times New Roman"/>
+          <w:color w:val="D4D4D4"/>
+          <w:sz w:val="21"/>
+          <w:szCs w:val="21"/>
+        </w:rPr>
+        <w:t>.</w:t>
+      </w:r>
+      <w:r>
+        <w:rPr>
+          <w:rFonts w:ascii="Consolas" w:eastAsia="Times New Roman" w:hAnsi="Consolas" w:cs="Times New Roman"/>
+          <w:color w:val="4EC9B0"/>
+          <w:sz w:val="21"/>
+          <w:szCs w:val="21"/>
+        </w:rPr>
+        <w:t>path</w:t>
+      </w:r>
+      <w:r>
+        <w:rPr>
+          <w:rFonts w:ascii="Consolas" w:eastAsia="Times New Roman" w:hAnsi="Consolas" w:cs="Times New Roman"/>
+          <w:color w:val="D4D4D4"/>
+          <w:sz w:val="21"/>
+          <w:szCs w:val="21"/>
+        </w:rPr>
+        <w:t>.</w:t>
+      </w:r>
+      <w:r>
+        <w:rPr>
+          <w:rFonts w:ascii="Consolas" w:eastAsia="Times New Roman" w:hAnsi="Consolas" w:cs="Times New Roman"/>
+          <w:color w:val="DCDCAA"/>
+          <w:sz w:val="21"/>
+          <w:szCs w:val="21"/>
+        </w:rPr>
+        <w:t>dirname</w:t>
+      </w:r>
+      <w:r>
+        <w:rPr>
+          <w:rFonts w:ascii="Consolas" w:eastAsia="Times New Roman" w:hAnsi="Consolas" w:cs="Times New Roman"/>
+          <w:color w:val="D4D4D4"/>
+          <w:sz w:val="21"/>
+          <w:szCs w:val="21"/>
+        </w:rPr>
+        <w:t>(</w:t>
+      </w:r>
+      <w:r>
+        <w:rPr>
+          <w:rFonts w:ascii="Consolas" w:eastAsia="Times New Roman" w:hAnsi="Consolas" w:cs="Times New Roman"/>
+          <w:color w:val="4EC9B0"/>
+          <w:sz w:val="21"/>
+          <w:szCs w:val="21"/>
+        </w:rPr>
+        <w:t>os</w:t>
+      </w:r>
+      <w:r>
+        <w:rPr>
+          <w:rFonts w:ascii="Consolas" w:eastAsia="Times New Roman" w:hAnsi="Consolas" w:cs="Times New Roman"/>
+          <w:color w:val="D4D4D4"/>
+          <w:sz w:val="21"/>
+          <w:szCs w:val="21"/>
+        </w:rPr>
+        <w:t>.</w:t>
+      </w:r>
+      <w:r>
+        <w:rPr>
+          <w:rFonts w:ascii="Consolas" w:eastAsia="Times New Roman" w:hAnsi="Consolas" w:cs="Times New Roman"/>
+          <w:color w:val="4EC9B0"/>
+          <w:sz w:val="21"/>
+          <w:szCs w:val="21"/>
+        </w:rPr>
+        <w:t>path</w:t>
+      </w:r>
+      <w:r>
+        <w:rPr>
+          <w:rFonts w:ascii="Consolas" w:eastAsia="Times New Roman" w:hAnsi="Consolas" w:cs="Times New Roman"/>
+          <w:color w:val="D4D4D4"/>
+          <w:sz w:val="21"/>
+          <w:szCs w:val="21"/>
+        </w:rPr>
+        <w:t>.</w:t>
+      </w:r>
+      <w:r>
+        <w:rPr>
+          <w:rFonts w:ascii="Consolas" w:eastAsia="Times New Roman" w:hAnsi="Consolas" w:cs="Times New Roman"/>
+          <w:color w:val="DCDCAA"/>
+          <w:sz w:val="21"/>
+          <w:szCs w:val="21"/>
+        </w:rPr>
+        <w:t>abspath</w:t>
+      </w:r>
+      <w:r>
+        <w:rPr>
+          <w:rFonts w:ascii="Consolas" w:eastAsia="Times New Roman" w:hAnsi="Consolas" w:cs="Times New Roman"/>
+          <w:color w:val="D4D4D4"/>
+          <w:sz w:val="21"/>
+          <w:szCs w:val="21"/>
+        </w:rPr>
+        <w:t>(</w:t>
+      </w:r>
+      <w:r>
+        <w:rPr>
+          <w:rFonts w:ascii="Consolas" w:eastAsia="Times New Roman" w:hAnsi="Consolas" w:cs="Times New Roman"/>
+          <w:color w:val="9CDCFE"/>
+          <w:sz w:val="21"/>
+          <w:szCs w:val="21"/>
+        </w:rPr>
+        <w:t>__file__</w:t>
+      </w:r>
+      <w:r>
+        <w:rPr>
+          <w:rFonts w:ascii="Consolas" w:eastAsia="Times New Roman" w:hAnsi="Consolas" w:cs="Times New Roman"/>
+          <w:color w:val="D4D4D4"/>
+          <w:sz w:val="21"/>
+          <w:szCs w:val="21"/>
+        </w:rPr>
+        <w:t>))))</w:t>
+      </w:r>
+    </w:p>
+    <w:p>
+      <w:pPr>
+        <w:shd w:val="clear" w:color="auto" w:fill="1E1E1E"/>
+        <w:spacing w:after="0" w:line="285" w:lineRule="atLeast"/>
+        <w:rPr>
+          <w:rFonts w:ascii="Consolas" w:eastAsia="Times New Roman" w:hAnsi="Consolas" w:cs="Times New Roman"/>
+          <w:color w:val="D4D4D4"/>
+          <w:sz w:val="21"/>
+          <w:szCs w:val="21"/>
+        </w:rPr>
+      </w:pPr>
+      <w:r>
+        <w:rPr>
+          <w:rFonts w:ascii="Consolas" w:eastAsia="Times New Roman" w:hAnsi="Consolas" w:cs="Times New Roman"/>
+          <w:color w:val="9CDCFE"/>
+          <w:sz w:val="21"/>
+          <w:szCs w:val="21"/>
+        </w:rPr>
+        <w:t>db_path</w:t>
+      </w:r>
+      <w:r>
+        <w:rPr>
+          <w:rFonts w:ascii="Consolas" w:eastAsia="Times New Roman" w:hAnsi="Consolas" w:cs="Times New Roman"/>
+          <w:color w:val="D4D4D4"/>
+          <w:sz w:val="21"/>
+          <w:szCs w:val="21"/>
+        </w:rPr>
+        <w:t xml:space="preserve"> = </w:t>
+      </w:r>
+      <w:r>
+        <w:rPr>
+          <w:rFonts w:ascii="Consolas" w:eastAsia="Times New Roman" w:hAnsi="Consolas" w:cs="Times New Roman"/>
+          <w:color w:val="4EC9B0"/>
+          <w:sz w:val="21"/>
+          <w:szCs w:val="21"/>
+        </w:rPr>
+        <w:t>os</w:t>
+      </w:r>
+      <w:r>
+        <w:rPr>
+          <w:rFonts w:ascii="Consolas" w:eastAsia="Times New Roman" w:hAnsi="Consolas" w:cs="Times New Roman"/>
+          <w:color w:val="D4D4D4"/>
+          <w:sz w:val="21"/>
+          <w:szCs w:val="21"/>
+        </w:rPr>
+        <w:t>.</w:t>
+      </w:r>
+      <w:r>
+        <w:rPr>
+          <w:rFonts w:ascii="Consolas" w:eastAsia="Times New Roman" w:hAnsi="Consolas" w:cs="Times New Roman"/>
+          <w:color w:val="4EC9B0"/>
+          <w:sz w:val="21"/>
+          <w:szCs w:val="21"/>
+        </w:rPr>
+        <w:t>path</w:t>
+      </w:r>
+      <w:r>
+        <w:rPr>
+          <w:rFonts w:ascii="Consolas" w:eastAsia="Times New Roman" w:hAnsi="Consolas" w:cs="Times New Roman"/>
+          <w:color w:val="D4D4D4"/>
+          <w:sz w:val="21"/>
+          <w:szCs w:val="21"/>
+        </w:rPr>
+        <w:t>.</w:t>
+      </w:r>
+      <w:r>
+        <w:rPr>
+          <w:rFonts w:ascii="Consolas" w:eastAsia="Times New Roman" w:hAnsi="Consolas" w:cs="Times New Roman"/>
+          <w:color w:val="DCDCAA"/>
+          <w:sz w:val="21"/>
+          <w:szCs w:val="21"/>
+        </w:rPr>
+        <w:t>join</w:t>
+      </w:r>
+      <w:r>
+        <w:rPr>
+          <w:rFonts w:ascii="Consolas" w:eastAsia="Times New Roman" w:hAnsi="Consolas" w:cs="Times New Roman"/>
+          <w:color w:val="D4D4D4"/>
+          <w:sz w:val="21"/>
+          <w:szCs w:val="21"/>
+        </w:rPr>
+        <w:t>(</w:t>
+      </w:r>
+      <w:r>
+        <w:rPr>
+          <w:rFonts w:ascii="Consolas" w:eastAsia="Times New Roman" w:hAnsi="Consolas" w:cs="Times New Roman"/>
+          <w:color w:val="4FC1FF"/>
+          <w:sz w:val="21"/>
+          <w:szCs w:val="21"/>
+        </w:rPr>
+        <w:t>BASE_DIR</w:t>
+      </w:r>
+      <w:r>
+        <w:rPr>
+          <w:rFonts w:ascii="Consolas" w:eastAsia="Times New Roman" w:hAnsi="Consolas" w:cs="Times New Roman"/>
+          <w:color w:val="D4D4D4"/>
+          <w:sz w:val="21"/>
+          <w:szCs w:val="21"/>
+        </w:rPr>
+        <w:t>,</w:t>
+      </w:r>
+      <w:r>
+        <w:rPr>
+          <w:rFonts w:ascii="Consolas" w:eastAsia="Times New Roman" w:hAnsi="Consolas" w:cs="Times New Roman"/>
+          <w:color w:val="CE9178"/>
+          <w:sz w:val="21"/>
+          <w:szCs w:val="21"/>
+        </w:rPr>
+        <w:t>"sqlite.db"</w:t>
+      </w:r>
+      <w:r>
+        <w:rPr>
+          <w:rFonts w:ascii="Consolas" w:eastAsia="Times New Roman" w:hAnsi="Consolas" w:cs="Times New Roman"/>
+          <w:color w:val="D4D4D4"/>
+          <w:sz w:val="21"/>
+          <w:szCs w:val="21"/>
+        </w:rPr>
+        <w:t>)</w:t>
+      </w:r>
+    </w:p>
+    <w:p>
+      <w:pPr>
+        <w:shd w:val="clear" w:color="auto" w:fill="1E1E1E"/>
+        <w:spacing w:after="0" w:line="285" w:lineRule="atLeast"/>
+        <w:rPr>
+          <w:rFonts w:ascii="Consolas" w:eastAsia="Times New Roman" w:hAnsi="Consolas" w:cs="Times New Roman"/>
+          <w:color w:val="D4D4D4"/>
+          <w:sz w:val="21"/>
+          <w:szCs w:val="21"/>
+        </w:rPr>
+      </w:pPr>
+    </w:p>
+    <w:p>
+      <w:pPr>
+        <w:shd w:val="clear" w:color="auto" w:fill="1E1E1E"/>
+        <w:spacing w:after="0" w:line="285" w:lineRule="atLeast"/>
+        <w:rPr>
+          <w:rFonts w:ascii="Consolas" w:eastAsia="Times New Roman" w:hAnsi="Consolas" w:cs="Times New Roman"/>
+          <w:color w:val="D4D4D4"/>
+          <w:sz w:val="21"/>
+          <w:szCs w:val="21"/>
+        </w:rPr>
+      </w:pPr>
+      <w:r>
+        <w:rPr>
+          <w:rFonts w:ascii="Consolas" w:eastAsia="Times New Roman" w:hAnsi="Consolas" w:cs="Times New Roman"/>
+          <w:color w:val="4FC1FF"/>
+          <w:sz w:val="21"/>
+          <w:szCs w:val="21"/>
+        </w:rPr>
+        <w:t>DATABASE_URL</w:t>
+      </w:r>
+      <w:r>
+        <w:rPr>
+          <w:rFonts w:ascii="Consolas" w:eastAsia="Times New Roman" w:hAnsi="Consolas" w:cs="Times New Roman"/>
+          <w:color w:val="D4D4D4"/>
+          <w:sz w:val="21"/>
+          <w:szCs w:val="21"/>
+        </w:rPr>
+        <w:t xml:space="preserve"> = </w:t>
+      </w:r>
+      <w:r>
+        <w:rPr>
+          <w:rFonts w:ascii="Consolas" w:eastAsia="Times New Roman" w:hAnsi="Consolas" w:cs="Times New Roman"/>
+          <w:color w:val="569CD6"/>
+          <w:sz w:val="21"/>
+          <w:szCs w:val="21"/>
+        </w:rPr>
+        <w:t>f</w:t>
+      </w:r>
+      <w:r>
+        <w:rPr>
+          <w:rFonts w:ascii="Consolas" w:eastAsia="Times New Roman" w:hAnsi="Consolas" w:cs="Times New Roman"/>
+          <w:color w:val="CE9178"/>
+          <w:sz w:val="21"/>
+          <w:szCs w:val="21"/>
+        </w:rPr>
+        <w:t>"sqlite+aiosqlite:///</w:t>
+      </w:r>
+      <w:r>
+        <w:rPr>
+          <w:rFonts w:ascii="Consolas" w:eastAsia="Times New Roman" w:hAnsi="Consolas" w:cs="Times New Roman"/>
+          <w:color w:val="569CD6"/>
+          <w:sz w:val="21"/>
+          <w:szCs w:val="21"/>
+        </w:rPr>
+        <w:t>{</w:t>
+      </w:r>
+      <w:r>
+        <w:rPr>
+          <w:rFonts w:ascii="Consolas" w:eastAsia="Times New Roman" w:hAnsi="Consolas" w:cs="Times New Roman"/>
+          <w:color w:val="9CDCFE"/>
+          <w:sz w:val="21"/>
+          <w:szCs w:val="21"/>
+        </w:rPr>
+        <w:t>db_path</w:t>
+      </w:r>
+      <w:r>
+        <w:rPr>
+          <w:rFonts w:ascii="Consolas" w:eastAsia="Times New Roman" w:hAnsi="Consolas" w:cs="Times New Roman"/>
+          <w:color w:val="569CD6"/>
+          <w:sz w:val="21"/>
+          <w:szCs w:val="21"/>
+        </w:rPr>
+        <w:t>}</w:t>
+      </w:r>
+      <w:r>
+        <w:rPr>
+          <w:rFonts w:ascii="Consolas" w:eastAsia="Times New Roman" w:hAnsi="Consolas" w:cs="Times New Roman"/>
+          <w:color w:val="CE9178"/>
+          <w:sz w:val="21"/>
+          <w:szCs w:val="21"/>
+        </w:rPr>
+        <w:t>"</w:t>
+      </w:r>
+    </w:p>
+    <w:p>
+      <w:pPr>
+        <w:shd w:val="clear" w:color="auto" w:fill="1E1E1E"/>
+        <w:spacing w:after="0" w:line="285" w:lineRule="atLeast"/>
+        <w:rPr>
+          <w:rFonts w:ascii="Consolas" w:eastAsia="Times New Roman" w:hAnsi="Consolas" w:cs="Times New Roman"/>
+          <w:color w:val="D4D4D4"/>
+          <w:sz w:val="21"/>
+          <w:szCs w:val="21"/>
+        </w:rPr>
+      </w:pPr>
+    </w:p>
+    <w:p>
+      <w:pPr>
+        <w:shd w:val="clear" w:color="auto" w:fill="1E1E1E"/>
+        <w:spacing w:after="0" w:line="285" w:lineRule="atLeast"/>
+        <w:rPr>
+          <w:rFonts w:ascii="Consolas" w:eastAsia="Times New Roman" w:hAnsi="Consolas" w:cs="Times New Roman"/>
+          <w:color w:val="D4D4D4"/>
+          <w:sz w:val="21"/>
+          <w:szCs w:val="21"/>
+        </w:rPr>
+      </w:pPr>
+      <w:r>
+        <w:rPr>
+          <w:rFonts w:ascii="Consolas" w:eastAsia="Times New Roman" w:hAnsi="Consolas" w:cs="Times New Roman"/>
+          <w:color w:val="9CDCFE"/>
+          <w:sz w:val="21"/>
+          <w:szCs w:val="21"/>
+        </w:rPr>
+        <w:t>engine</w:t>
+      </w:r>
+      <w:r>
+        <w:rPr>
+          <w:rFonts w:ascii="Consolas" w:eastAsia="Times New Roman" w:hAnsi="Consolas" w:cs="Times New Roman"/>
+          <w:color w:val="D4D4D4"/>
+          <w:sz w:val="21"/>
+          <w:szCs w:val="21"/>
+        </w:rPr>
+        <w:t xml:space="preserve"> = </w:t>
+      </w:r>
+      <w:r>
+        <w:rPr>
+          <w:rFonts w:ascii="Consolas" w:eastAsia="Times New Roman" w:hAnsi="Consolas" w:cs="Times New Roman"/>
+          <w:color w:val="DCDCAA"/>
+          <w:sz w:val="21"/>
+          <w:szCs w:val="21"/>
+        </w:rPr>
+        <w:t>create_async_engine</w:t>
+      </w:r>
+      <w:r>
+        <w:rPr>
+          <w:rFonts w:ascii="Consolas" w:eastAsia="Times New Roman" w:hAnsi="Consolas" w:cs="Times New Roman"/>
+          <w:color w:val="D4D4D4"/>
+          <w:sz w:val="21"/>
+          <w:szCs w:val="21"/>
+        </w:rPr>
+        <w:t>(</w:t>
+      </w:r>
+      <w:r>
+        <w:rPr>
+          <w:rFonts w:ascii="Consolas" w:eastAsia="Times New Roman" w:hAnsi="Consolas" w:cs="Times New Roman"/>
+          <w:color w:val="4FC1FF"/>
+          <w:sz w:val="21"/>
+          <w:szCs w:val="21"/>
+        </w:rPr>
+        <w:t>DATABASE_URL</w:t>
+      </w:r>
+      <w:r>
+        <w:rPr>
+          <w:rFonts w:ascii="Consolas" w:eastAsia="Times New Roman" w:hAnsi="Consolas" w:cs="Times New Roman"/>
+          <w:color w:val="D4D4D4"/>
+          <w:sz w:val="21"/>
+          <w:szCs w:val="21"/>
+        </w:rPr>
+        <w:t xml:space="preserve">, </w:t>
+      </w:r>
+      <w:r>
+        <w:rPr>
+          <w:rFonts w:ascii="Consolas" w:eastAsia="Times New Roman" w:hAnsi="Consolas" w:cs="Times New Roman"/>
+          <w:color w:val="9CDCFE"/>
+          <w:sz w:val="21"/>
+          <w:szCs w:val="21"/>
+        </w:rPr>
+        <w:t>echo</w:t>
+      </w:r>
+      <w:r>
+        <w:rPr>
+          <w:rFonts w:ascii="Consolas" w:eastAsia="Times New Roman" w:hAnsi="Consolas" w:cs="Times New Roman"/>
+          <w:color w:val="D4D4D4"/>
+          <w:sz w:val="21"/>
+          <w:szCs w:val="21"/>
+        </w:rPr>
+        <w:t>=</w:t>
+      </w:r>
+      <w:r>
+        <w:rPr>
+          <w:rFonts w:ascii="Consolas" w:eastAsia="Times New Roman" w:hAnsi="Consolas" w:cs="Times New Roman"/>
+          <w:color w:val="4FC1FF"/>
+          <w:sz w:val="21"/>
+          <w:szCs w:val="21"/>
+        </w:rPr>
+        <w:t>True</w:t>
+      </w:r>
+      <w:r>
+        <w:rPr>
+          <w:rFonts w:ascii="Consolas" w:eastAsia="Times New Roman" w:hAnsi="Consolas" w:cs="Times New Roman"/>
+          <w:color w:val="D4D4D4"/>
+          <w:sz w:val="21"/>
+          <w:szCs w:val="21"/>
+        </w:rPr>
+        <w:t>)</w:t>
+      </w:r>
+    </w:p>
+    <w:p>
+      <w:pPr>
+        <w:shd w:val="clear" w:color="auto" w:fill="1E1E1E"/>
+        <w:spacing w:after="0" w:line="285" w:lineRule="atLeast"/>
+        <w:rPr>
+          <w:rFonts w:ascii="Consolas" w:eastAsia="Times New Roman" w:hAnsi="Consolas" w:cs="Times New Roman"/>
+          <w:color w:val="D4D4D4"/>
+          <w:sz w:val="21"/>
+          <w:szCs w:val="21"/>
+        </w:rPr>
+      </w:pPr>
+    </w:p>
+    <w:p>
+      <w:pPr>
+        <w:shd w:val="clear" w:color="auto" w:fill="1E1E1E"/>
+        <w:spacing w:after="0" w:line="285" w:lineRule="atLeast"/>
+        <w:rPr>
+          <w:rFonts w:ascii="Consolas" w:eastAsia="Times New Roman" w:hAnsi="Consolas" w:cs="Times New Roman"/>
+          <w:color w:val="D4D4D4"/>
+          <w:sz w:val="21"/>
+          <w:szCs w:val="21"/>
+        </w:rPr>
+      </w:pPr>
+      <w:r>
+        <w:rPr>
+          <w:rFonts w:ascii="Consolas" w:eastAsia="Times New Roman" w:hAnsi="Consolas" w:cs="Times New Roman"/>
+          <w:color w:val="9CDCFE"/>
+          <w:sz w:val="21"/>
+          <w:szCs w:val="21"/>
+        </w:rPr>
+        <w:t>async_session</w:t>
+      </w:r>
+      <w:r>
+        <w:rPr>
+          <w:rFonts w:ascii="Consolas" w:eastAsia="Times New Roman" w:hAnsi="Consolas" w:cs="Times New Roman"/>
+          <w:color w:val="D4D4D4"/>
+          <w:sz w:val="21"/>
+          <w:szCs w:val="21"/>
+        </w:rPr>
+        <w:t xml:space="preserve"> = </w:t>
+      </w:r>
+      <w:r>
+        <w:rPr>
+          <w:rFonts w:ascii="Consolas" w:eastAsia="Times New Roman" w:hAnsi="Consolas" w:cs="Times New Roman"/>
+          <w:color w:val="4EC9B0"/>
+          <w:sz w:val="21"/>
+          <w:szCs w:val="21"/>
+        </w:rPr>
+        <w:t>async_sessionmaker</w:t>
+      </w:r>
+      <w:r>
+        <w:rPr>
+          <w:rFonts w:ascii="Consolas" w:eastAsia="Times New Roman" w:hAnsi="Consolas" w:cs="Times New Roman"/>
+          <w:color w:val="D4D4D4"/>
+          <w:sz w:val="21"/>
+          <w:szCs w:val="21"/>
+        </w:rPr>
+        <w:t>(</w:t>
+      </w:r>
+      <w:r>
+        <w:rPr>
+          <w:rFonts w:ascii="Consolas" w:eastAsia="Times New Roman" w:hAnsi="Consolas" w:cs="Times New Roman"/>
+          <w:color w:val="9CDCFE"/>
+          <w:sz w:val="21"/>
+          <w:szCs w:val="21"/>
+        </w:rPr>
+        <w:t>bind</w:t>
+      </w:r>
+      <w:r>
+        <w:rPr>
+          <w:rFonts w:ascii="Consolas" w:eastAsia="Times New Roman" w:hAnsi="Consolas" w:cs="Times New Roman"/>
+          <w:color w:val="D4D4D4"/>
+          <w:sz w:val="21"/>
+          <w:szCs w:val="21"/>
+        </w:rPr>
+        <w:t>=</w:t>
+      </w:r>
+      <w:r>
+        <w:rPr>
+          <w:rFonts w:ascii="Consolas" w:eastAsia="Times New Roman" w:hAnsi="Consolas" w:cs="Times New Roman"/>
+          <w:color w:val="9CDCFE"/>
+          <w:sz w:val="21"/>
+          <w:szCs w:val="21"/>
+        </w:rPr>
+        <w:t>engine</w:t>
+      </w:r>
+      <w:r>
+        <w:rPr>
+          <w:rFonts w:ascii="Consolas" w:eastAsia="Times New Roman" w:hAnsi="Consolas" w:cs="Times New Roman"/>
+          <w:color w:val="D4D4D4"/>
+          <w:sz w:val="21"/>
+          <w:szCs w:val="21"/>
+        </w:rPr>
+        <w:t xml:space="preserve">, </w:t>
+      </w:r>
+      <w:r>
+        <w:rPr>
+          <w:rFonts w:ascii="Consolas" w:eastAsia="Times New Roman" w:hAnsi="Consolas" w:cs="Times New Roman"/>
+          <w:color w:val="9CDCFE"/>
+          <w:sz w:val="21"/>
+          <w:szCs w:val="21"/>
+        </w:rPr>
+        <w:t>expire_on_commit</w:t>
+      </w:r>
+      <w:r>
+        <w:rPr>
+          <w:rFonts w:ascii="Consolas" w:eastAsia="Times New Roman" w:hAnsi="Consolas" w:cs="Times New Roman"/>
+          <w:color w:val="D4D4D4"/>
+          <w:sz w:val="21"/>
+          <w:szCs w:val="21"/>
+        </w:rPr>
+        <w:t>=</w:t>
+      </w:r>
+      <w:r>
+        <w:rPr>
+          <w:rFonts w:ascii="Consolas" w:eastAsia="Times New Roman" w:hAnsi="Consolas" w:cs="Times New Roman"/>
+          <w:color w:val="4FC1FF"/>
+          <w:sz w:val="21"/>
+          <w:szCs w:val="21"/>
+        </w:rPr>
+        <w:t>False</w:t>
+      </w:r>
+      <w:r>
+        <w:rPr>
+          <w:rFonts w:ascii="Consolas" w:eastAsia="Times New Roman" w:hAnsi="Consolas" w:cs="Times New Roman"/>
+          <w:color w:val="D4D4D4"/>
+          <w:sz w:val="21"/>
+          <w:szCs w:val="21"/>
+        </w:rPr>
+        <w:t>)</w:t>
+      </w:r>
+    </w:p>
+    <w:p>
+      <w:pPr>
+        <w:shd w:val="clear" w:color="auto" w:fill="1E1E1E"/>
+        <w:spacing w:after="240" w:line="285" w:lineRule="atLeast"/>
+        <w:rPr>
+          <w:rFonts w:ascii="Consolas" w:eastAsia="Times New Roman" w:hAnsi="Consolas" w:cs="Times New Roman"/>
+          <w:color w:val="D4D4D4"/>
+          <w:sz w:val="21"/>
+          <w:szCs w:val="21"/>
+        </w:rPr>
+      </w:pPr>
+      <w:r>
+        <w:rPr>
+          <w:rFonts w:ascii="Consolas" w:eastAsia="Times New Roman" w:hAnsi="Consolas" w:cs="Times New Roman"/>
+          <w:color w:val="D4D4D4"/>
+          <w:sz w:val="21"/>
+          <w:szCs w:val="21"/>
+        </w:rPr>
+        <w:br/>
+      </w:r>
+    </w:p>
+    <w:p>
+      <w:pPr>
+        <w:shd w:val="clear" w:color="auto" w:fill="1E1E1E"/>
+        <w:spacing w:after="0" w:line="285" w:lineRule="atLeast"/>
+        <w:rPr>
+          <w:rFonts w:ascii="Consolas" w:eastAsia="Times New Roman" w:hAnsi="Consolas" w:cs="Times New Roman"/>
+          <w:color w:val="D4D4D4"/>
+          <w:sz w:val="21"/>
+          <w:szCs w:val="21"/>
+        </w:rPr>
+      </w:pPr>
+      <w:r>
+        <w:rPr>
+          <w:rFonts w:ascii="Consolas" w:eastAsia="Times New Roman" w:hAnsi="Consolas" w:cs="Times New Roman"/>
+          <w:color w:val="6A9955"/>
+          <w:sz w:val="21"/>
+          <w:szCs w:val="21"/>
+        </w:rPr>
+        <w:t># async def get_db():</w:t>
+      </w:r>
+    </w:p>
+    <w:p>
+      <w:pPr>
+        <w:shd w:val="clear" w:color="auto" w:fill="1E1E1E"/>
+        <w:spacing w:after="0" w:line="285" w:lineRule="atLeast"/>
+        <w:rPr>
+          <w:rFonts w:ascii="Consolas" w:eastAsia="Times New Roman" w:hAnsi="Consolas" w:cs="Times New Roman"/>
+          <w:color w:val="D4D4D4"/>
+          <w:sz w:val="21"/>
+          <w:szCs w:val="21"/>
+        </w:rPr>
+      </w:pPr>
+      <w:r>
+        <w:rPr>
+          <w:rFonts w:ascii="Consolas" w:eastAsia="Times New Roman" w:hAnsi="Consolas" w:cs="Times New Roman"/>
+          <w:color w:val="6A9955"/>
+          <w:sz w:val="21"/>
+          <w:szCs w:val="21"/>
+        </w:rPr>
+        <w:t>#     async with async_session() as session:</w:t>
+      </w:r>
+    </w:p>
+    <w:p>
+      <w:pPr>
+        <w:shd w:val="clear" w:color="auto" w:fill="1E1E1E"/>
+        <w:spacing w:after="0" w:line="285" w:lineRule="atLeast"/>
+        <w:rPr>
+          <w:rFonts w:ascii="Consolas" w:eastAsia="Times New Roman" w:hAnsi="Consolas" w:cs="Times New Roman"/>
+          <w:color w:val="D4D4D4"/>
+          <w:sz w:val="21"/>
+          <w:szCs w:val="21"/>
+        </w:rPr>
+      </w:pPr>
+      <w:r>
+        <w:rPr>
+          <w:rFonts w:ascii="Consolas" w:eastAsia="Times New Roman" w:hAnsi="Consolas" w:cs="Times New Roman"/>
+          <w:color w:val="6A9955"/>
+          <w:sz w:val="21"/>
+          <w:szCs w:val="21"/>
+        </w:rPr>
+        <w:t xml:space="preserve">#         yield session </w:t>
+      </w:r>
+    </w:p>
+    <w:p>
+      <w:pPr>
+        <w:shd w:val="clear" w:color="auto" w:fill="1E1E1E"/>
+        <w:spacing w:after="0" w:line="285" w:lineRule="atLeast"/>
+        <w:rPr>
+          <w:rFonts w:ascii="Consolas" w:eastAsia="Times New Roman" w:hAnsi="Consolas" w:cs="Times New Roman"/>
+          <w:color w:val="D4D4D4"/>
+          <w:sz w:val="21"/>
+          <w:szCs w:val="21"/>
+        </w:rPr>
+      </w:pPr>
+      <w:r>
+        <w:rPr>
+          <w:rFonts w:ascii="Consolas" w:eastAsia="Times New Roman" w:hAnsi="Consolas" w:cs="Times New Roman"/>
+          <w:color w:val="D4D4D4"/>
+          <w:sz w:val="21"/>
+          <w:szCs w:val="21"/>
+        </w:rPr>
+        <w:t xml:space="preserve">        </w:t>
+      </w:r>
+    </w:p>
+    <w:p>
+      <w:pPr>
+        <w:shd w:val="clear" w:color="auto" w:fill="1E1E1E"/>
+        <w:spacing w:after="0" w:line="285" w:lineRule="atLeast"/>
+        <w:rPr>
+          <w:rFonts w:ascii="Consolas" w:eastAsia="Times New Roman" w:hAnsi="Consolas" w:cs="Times New Roman"/>
+          <w:color w:val="D4D4D4"/>
+          <w:sz w:val="21"/>
+          <w:szCs w:val="21"/>
+        </w:rPr>
+      </w:pPr>
+    </w:p>
+    <w:p>
+      <w:pPr>
+        <w:shd w:val="clear" w:color="auto" w:fill="1E1E1E"/>
+        <w:spacing w:after="0" w:line="285" w:lineRule="atLeast"/>
+        <w:rPr>
+          <w:rFonts w:ascii="Consolas" w:eastAsia="Times New Roman" w:hAnsi="Consolas" w:cs="Times New Roman"/>
+          <w:color w:val="D4D4D4"/>
+          <w:sz w:val="21"/>
+          <w:szCs w:val="21"/>
+        </w:rPr>
+      </w:pPr>
+      <w:r>
+        <w:rPr>
+          <w:rFonts w:ascii="Consolas" w:eastAsia="Times New Roman" w:hAnsi="Consolas" w:cs="Times New Roman"/>
+          <w:color w:val="569CD6"/>
+          <w:sz w:val="21"/>
+          <w:szCs w:val="21"/>
+        </w:rPr>
+        <w:t>async</w:t>
+      </w:r>
+      <w:r>
+        <w:rPr>
+          <w:rFonts w:ascii="Consolas" w:eastAsia="Times New Roman" w:hAnsi="Consolas" w:cs="Times New Roman"/>
+          <w:color w:val="D4D4D4"/>
+          <w:sz w:val="21"/>
+          <w:szCs w:val="21"/>
+        </w:rPr>
+        <w:t xml:space="preserve"> </w:t>
+      </w:r>
+      <w:r>
+        <w:rPr>
+          <w:rFonts w:ascii="Consolas" w:eastAsia="Times New Roman" w:hAnsi="Consolas" w:cs="Times New Roman"/>
+          <w:color w:val="569CD6"/>
+          <w:sz w:val="21"/>
+          <w:szCs w:val="21"/>
+        </w:rPr>
+        <w:t>def</w:t>
+      </w:r>
+      <w:r>
+        <w:rPr>
+          <w:rFonts w:ascii="Consolas" w:eastAsia="Times New Roman" w:hAnsi="Consolas" w:cs="Times New Roman"/>
+          <w:color w:val="D4D4D4"/>
+          <w:sz w:val="21"/>
+          <w:szCs w:val="21"/>
+        </w:rPr>
+        <w:t xml:space="preserve"> </w:t>
+      </w:r>
+      <w:r>
+        <w:rPr>
+          <w:rFonts w:ascii="Consolas" w:eastAsia="Times New Roman" w:hAnsi="Consolas" w:cs="Times New Roman"/>
+          <w:color w:val="DCDCAA"/>
+          <w:sz w:val="21"/>
+          <w:szCs w:val="21"/>
+        </w:rPr>
+        <w:t>get_db</w:t>
+      </w:r>
+      <w:r>
+        <w:rPr>
+          <w:rFonts w:ascii="Consolas" w:eastAsia="Times New Roman" w:hAnsi="Consolas" w:cs="Times New Roman"/>
+          <w:color w:val="D4D4D4"/>
+          <w:sz w:val="21"/>
+          <w:szCs w:val="21"/>
+        </w:rPr>
+        <w:t>():</w:t>
+      </w:r>
+    </w:p>
+    <w:p>
+      <w:pPr>
+        <w:shd w:val="clear" w:color="auto" w:fill="1E1E1E"/>
+        <w:spacing w:after="0" w:line="285" w:lineRule="atLeast"/>
+        <w:rPr>
+          <w:rFonts w:ascii="Consolas" w:eastAsia="Times New Roman" w:hAnsi="Consolas" w:cs="Times New Roman"/>
+          <w:color w:val="D4D4D4"/>
+          <w:sz w:val="21"/>
+          <w:szCs w:val="21"/>
+        </w:rPr>
+      </w:pPr>
+      <w:r>
+        <w:rPr>
+          <w:rFonts w:ascii="Consolas" w:eastAsia="Times New Roman" w:hAnsi="Consolas" w:cs="Times New Roman"/>
+          <w:color w:val="D4D4D4"/>
+          <w:sz w:val="21"/>
+          <w:szCs w:val="21"/>
+        </w:rPr>
+        <w:t xml:space="preserve">    </w:t>
+      </w:r>
+      <w:r>
+        <w:rPr>
+          <w:rFonts w:ascii="Consolas" w:eastAsia="Times New Roman" w:hAnsi="Consolas" w:cs="Times New Roman"/>
+          <w:color w:val="9CDCFE"/>
+          <w:sz w:val="21"/>
+          <w:szCs w:val="21"/>
+        </w:rPr>
+        <w:t>session</w:t>
+      </w:r>
+      <w:r>
+        <w:rPr>
+          <w:rFonts w:ascii="Consolas" w:eastAsia="Times New Roman" w:hAnsi="Consolas" w:cs="Times New Roman"/>
+          <w:color w:val="D4D4D4"/>
+          <w:sz w:val="21"/>
+          <w:szCs w:val="21"/>
+        </w:rPr>
+        <w:t xml:space="preserve"> = </w:t>
+      </w:r>
+      <w:r>
+        <w:rPr>
+          <w:rFonts w:ascii="Consolas" w:eastAsia="Times New Roman" w:hAnsi="Consolas" w:cs="Times New Roman"/>
+          <w:color w:val="9CDCFE"/>
+          <w:sz w:val="21"/>
+          <w:szCs w:val="21"/>
+        </w:rPr>
+        <w:t>async_session</w:t>
+      </w:r>
+      <w:r>
+        <w:rPr>
+          <w:rFonts w:ascii="Consolas" w:eastAsia="Times New Roman" w:hAnsi="Consolas" w:cs="Times New Roman"/>
+          <w:color w:val="D4D4D4"/>
+          <w:sz w:val="21"/>
+          <w:szCs w:val="21"/>
+        </w:rPr>
+        <w:t>()</w:t>
+      </w:r>
+    </w:p>
+    <w:p>
+      <w:pPr>
+        <w:shd w:val="clear" w:color="auto" w:fill="1E1E1E"/>
+        <w:spacing w:after="0" w:line="285" w:lineRule="atLeast"/>
+        <w:rPr>
+          <w:rFonts w:ascii="Consolas" w:eastAsia="Times New Roman" w:hAnsi="Consolas" w:cs="Times New Roman"/>
+          <w:color w:val="D4D4D4"/>
+          <w:sz w:val="21"/>
+          <w:szCs w:val="21"/>
+        </w:rPr>
+      </w:pPr>
+      <w:r>
+        <w:rPr>
+          <w:rFonts w:ascii="Consolas" w:eastAsia="Times New Roman" w:hAnsi="Consolas" w:cs="Times New Roman"/>
+          <w:color w:val="D4D4D4"/>
+          <w:sz w:val="21"/>
+          <w:szCs w:val="21"/>
+        </w:rPr>
+        <w:t xml:space="preserve">    </w:t>
+      </w:r>
+      <w:r>
+        <w:rPr>
+          <w:rFonts w:ascii="Consolas" w:eastAsia="Times New Roman" w:hAnsi="Consolas" w:cs="Times New Roman"/>
+          <w:color w:val="DCDCAA"/>
+          <w:sz w:val="21"/>
+          <w:szCs w:val="21"/>
+        </w:rPr>
+        <w:t>print</w:t>
+      </w:r>
+      <w:r>
+        <w:rPr>
+          <w:rFonts w:ascii="Consolas" w:eastAsia="Times New Roman" w:hAnsi="Consolas" w:cs="Times New Roman"/>
+          <w:color w:val="D4D4D4"/>
+          <w:sz w:val="21"/>
+          <w:szCs w:val="21"/>
+        </w:rPr>
+        <w:t>(</w:t>
+      </w:r>
+      <w:r>
+        <w:rPr>
+          <w:rFonts w:ascii="Consolas" w:eastAsia="Times New Roman" w:hAnsi="Consolas" w:cs="Times New Roman"/>
+          <w:color w:val="569CD6"/>
+          <w:sz w:val="21"/>
+          <w:szCs w:val="21"/>
+        </w:rPr>
+        <w:t>f</w:t>
+      </w:r>
+      <w:r>
+        <w:rPr>
+          <w:rFonts w:ascii="Consolas" w:eastAsia="Times New Roman" w:hAnsi="Consolas" w:cs="Times New Roman"/>
+          <w:color w:val="CE9178"/>
+          <w:sz w:val="21"/>
+          <w:szCs w:val="21"/>
+        </w:rPr>
+        <w:t xml:space="preserve">"Creating new AsyncSession: </w:t>
+      </w:r>
+      <w:r>
+        <w:rPr>
+          <w:rFonts w:ascii="Consolas" w:eastAsia="Times New Roman" w:hAnsi="Consolas" w:cs="Times New Roman"/>
+          <w:color w:val="569CD6"/>
+          <w:sz w:val="21"/>
+          <w:szCs w:val="21"/>
+        </w:rPr>
+        <w:t>{</w:t>
+      </w:r>
+      <w:r>
+        <w:rPr>
+          <w:rFonts w:ascii="Consolas" w:eastAsia="Times New Roman" w:hAnsi="Consolas" w:cs="Times New Roman"/>
+          <w:color w:val="DCDCAA"/>
+          <w:sz w:val="21"/>
+          <w:szCs w:val="21"/>
+        </w:rPr>
+        <w:t>id</w:t>
+      </w:r>
+      <w:r>
+        <w:rPr>
+          <w:rFonts w:ascii="Consolas" w:eastAsia="Times New Roman" w:hAnsi="Consolas" w:cs="Times New Roman"/>
+          <w:color w:val="D4D4D4"/>
+          <w:sz w:val="21"/>
+          <w:szCs w:val="21"/>
+        </w:rPr>
+        <w:t>(</w:t>
+      </w:r>
+      <w:r>
+        <w:rPr>
+          <w:rFonts w:ascii="Consolas" w:eastAsia="Times New Roman" w:hAnsi="Consolas" w:cs="Times New Roman"/>
+          <w:color w:val="9CDCFE"/>
+          <w:sz w:val="21"/>
+          <w:szCs w:val="21"/>
+        </w:rPr>
+        <w:t>session</w:t>
+      </w:r>
+      <w:r>
+        <w:rPr>
+          <w:rFonts w:ascii="Consolas" w:eastAsia="Times New Roman" w:hAnsi="Consolas" w:cs="Times New Roman"/>
+          <w:color w:val="D4D4D4"/>
+          <w:sz w:val="21"/>
+          <w:szCs w:val="21"/>
+        </w:rPr>
+        <w:t>)</w:t>
+      </w:r>
+      <w:r>
+        <w:rPr>
+          <w:rFonts w:ascii="Consolas" w:eastAsia="Times New Roman" w:hAnsi="Consolas" w:cs="Times New Roman"/>
+          <w:color w:val="569CD6"/>
+          <w:sz w:val="21"/>
+          <w:szCs w:val="21"/>
+        </w:rPr>
+        <w:t>}</w:t>
+      </w:r>
+      <w:r>
+        <w:rPr>
+          <w:rFonts w:ascii="Consolas" w:eastAsia="Times New Roman" w:hAnsi="Consolas" w:cs="Times New Roman"/>
+          <w:color w:val="CE9178"/>
+          <w:sz w:val="21"/>
+          <w:szCs w:val="21"/>
+        </w:rPr>
+        <w:t>"</w:t>
+      </w:r>
+      <w:r>
+        <w:rPr>
+          <w:rFonts w:ascii="Consolas" w:eastAsia="Times New Roman" w:hAnsi="Consolas" w:cs="Times New Roman"/>
+          <w:color w:val="D4D4D4"/>
+          <w:sz w:val="21"/>
+          <w:szCs w:val="21"/>
+        </w:rPr>
+        <w:t>)</w:t>
+      </w:r>
+    </w:p>
+    <w:p>
+      <w:pPr>
+        <w:shd w:val="clear" w:color="auto" w:fill="1E1E1E"/>
+        <w:spacing w:after="0" w:line="285" w:lineRule="atLeast"/>
+        <w:rPr>
+          <w:rFonts w:ascii="Consolas" w:eastAsia="Times New Roman" w:hAnsi="Consolas" w:cs="Times New Roman"/>
+          <w:color w:val="D4D4D4"/>
+          <w:sz w:val="21"/>
+          <w:szCs w:val="21"/>
+        </w:rPr>
+      </w:pPr>
+      <w:r>
+        <w:rPr>
+          <w:rFonts w:ascii="Consolas" w:eastAsia="Times New Roman" w:hAnsi="Consolas" w:cs="Times New Roman"/>
+          <w:color w:val="D4D4D4"/>
+          <w:sz w:val="21"/>
+          <w:szCs w:val="21"/>
+        </w:rPr>
+        <w:t xml:space="preserve">    </w:t>
+      </w:r>
+      <w:r>
+        <w:rPr>
+          <w:rFonts w:ascii="Consolas" w:eastAsia="Times New Roman" w:hAnsi="Consolas" w:cs="Times New Roman"/>
+          <w:color w:val="C586C0"/>
+          <w:sz w:val="21"/>
+          <w:szCs w:val="21"/>
+        </w:rPr>
+        <w:t>try</w:t>
+      </w:r>
+      <w:r>
+        <w:rPr>
+          <w:rFonts w:ascii="Consolas" w:eastAsia="Times New Roman" w:hAnsi="Consolas" w:cs="Times New Roman"/>
+          <w:color w:val="D4D4D4"/>
+          <w:sz w:val="21"/>
+          <w:szCs w:val="21"/>
+        </w:rPr>
+        <w:t>:</w:t>
+      </w:r>
+    </w:p>
+    <w:p>
+      <w:pPr>
+        <w:shd w:val="clear" w:color="auto" w:fill="1E1E1E"/>
+        <w:spacing w:after="0" w:line="285" w:lineRule="atLeast"/>
+        <w:rPr>
+          <w:rFonts w:ascii="Consolas" w:eastAsia="Times New Roman" w:hAnsi="Consolas" w:cs="Times New Roman"/>
+          <w:color w:val="D4D4D4"/>
+          <w:sz w:val="21"/>
+          <w:szCs w:val="21"/>
+        </w:rPr>
+      </w:pPr>
+      <w:r>
+        <w:rPr>
+          <w:rFonts w:ascii="Consolas" w:eastAsia="Times New Roman" w:hAnsi="Consolas" w:cs="Times New Roman"/>
+          <w:color w:val="D4D4D4"/>
+          <w:sz w:val="21"/>
+          <w:szCs w:val="21"/>
+        </w:rPr>
+        <w:t xml:space="preserve">        </w:t>
+      </w:r>
+      <w:r>
+        <w:rPr>
+          <w:rFonts w:ascii="Consolas" w:eastAsia="Times New Roman" w:hAnsi="Consolas" w:cs="Times New Roman"/>
+          <w:color w:val="C586C0"/>
+          <w:sz w:val="21"/>
+          <w:szCs w:val="21"/>
+        </w:rPr>
+        <w:t>async</w:t>
+      </w:r>
+      <w:r>
+        <w:rPr>
+          <w:rFonts w:ascii="Consolas" w:eastAsia="Times New Roman" w:hAnsi="Consolas" w:cs="Times New Roman"/>
+          <w:color w:val="D4D4D4"/>
+          <w:sz w:val="21"/>
+          <w:szCs w:val="21"/>
+        </w:rPr>
+        <w:t xml:space="preserve"> </w:t>
+      </w:r>
+      <w:r>
+        <w:rPr>
+          <w:rFonts w:ascii="Consolas" w:eastAsia="Times New Roman" w:hAnsi="Consolas" w:cs="Times New Roman"/>
+          <w:color w:val="C586C0"/>
+          <w:sz w:val="21"/>
+          <w:szCs w:val="21"/>
+        </w:rPr>
+        <w:t>with</w:t>
+      </w:r>
+      <w:r>
+        <w:rPr>
+          <w:rFonts w:ascii="Consolas" w:eastAsia="Times New Roman" w:hAnsi="Consolas" w:cs="Times New Roman"/>
+          <w:color w:val="D4D4D4"/>
+          <w:sz w:val="21"/>
+          <w:szCs w:val="21"/>
+        </w:rPr>
+        <w:t xml:space="preserve"> </w:t>
+      </w:r>
+      <w:r>
+        <w:rPr>
+          <w:rFonts w:ascii="Consolas" w:eastAsia="Times New Roman" w:hAnsi="Consolas" w:cs="Times New Roman"/>
+          <w:color w:val="9CDCFE"/>
+          <w:sz w:val="21"/>
+          <w:szCs w:val="21"/>
+        </w:rPr>
+        <w:t>session</w:t>
+      </w:r>
+      <w:r>
+        <w:rPr>
+          <w:rFonts w:ascii="Consolas" w:eastAsia="Times New Roman" w:hAnsi="Consolas" w:cs="Times New Roman"/>
+          <w:color w:val="D4D4D4"/>
+          <w:sz w:val="21"/>
+          <w:szCs w:val="21"/>
+        </w:rPr>
+        <w:t>:</w:t>
+      </w:r>
+    </w:p>
+    <w:p>
+      <w:pPr>
+        <w:shd w:val="clear" w:color="auto" w:fill="1E1E1E"/>
+        <w:spacing w:after="0" w:line="285" w:lineRule="atLeast"/>
+        <w:rPr>
+          <w:rFonts w:ascii="Consolas" w:eastAsia="Times New Roman" w:hAnsi="Consolas" w:cs="Times New Roman"/>
+          <w:color w:val="D4D4D4"/>
+          <w:sz w:val="21"/>
+          <w:szCs w:val="21"/>
+        </w:rPr>
+      </w:pPr>
+      <w:r>
+        <w:rPr>
+          <w:rFonts w:ascii="Consolas" w:eastAsia="Times New Roman" w:hAnsi="Consolas" w:cs="Times New Roman"/>
+          <w:color w:val="D4D4D4"/>
+          <w:sz w:val="21"/>
+          <w:szCs w:val="21"/>
+        </w:rPr>
+        <w:t xml:space="preserve">            </w:t>
+      </w:r>
+      <w:r>
+        <w:rPr>
+          <w:rFonts w:ascii="Consolas" w:eastAsia="Times New Roman" w:hAnsi="Consolas" w:cs="Times New Roman"/>
+          <w:color w:val="C586C0"/>
+          <w:sz w:val="21"/>
+          <w:szCs w:val="21"/>
+        </w:rPr>
+        <w:t>yield</w:t>
+      </w:r>
+      <w:r>
+        <w:rPr>
+          <w:rFonts w:ascii="Consolas" w:eastAsia="Times New Roman" w:hAnsi="Consolas" w:cs="Times New Roman"/>
+          <w:color w:val="D4D4D4"/>
+          <w:sz w:val="21"/>
+          <w:szCs w:val="21"/>
+        </w:rPr>
+        <w:t xml:space="preserve"> </w:t>
+      </w:r>
+      <w:r>
+        <w:rPr>
+          <w:rFonts w:ascii="Consolas" w:eastAsia="Times New Roman" w:hAnsi="Consolas" w:cs="Times New Roman"/>
+          <w:color w:val="9CDCFE"/>
+          <w:sz w:val="21"/>
+          <w:szCs w:val="21"/>
+        </w:rPr>
+        <w:t>session</w:t>
+      </w:r>
+    </w:p>
+    <w:p>
+      <w:pPr>
+        <w:shd w:val="clear" w:color="auto" w:fill="1E1E1E"/>
+        <w:spacing w:after="0" w:line="285" w:lineRule="atLeast"/>
+        <w:rPr>
+          <w:rFonts w:ascii="Consolas" w:eastAsia="Times New Roman" w:hAnsi="Consolas" w:cs="Times New Roman"/>
+          <w:color w:val="D4D4D4"/>
+          <w:sz w:val="21"/>
+          <w:szCs w:val="21"/>
+        </w:rPr>
+      </w:pPr>
+      <w:r>
+        <w:rPr>
+          <w:rFonts w:ascii="Consolas" w:eastAsia="Times New Roman" w:hAnsi="Consolas" w:cs="Times New Roman"/>
+          <w:color w:val="D4D4D4"/>
+          <w:sz w:val="21"/>
+          <w:szCs w:val="21"/>
+        </w:rPr>
+        <w:t xml:space="preserve">        </w:t>
+      </w:r>
+      <w:r>
+        <w:rPr>
+          <w:rFonts w:ascii="Consolas" w:eastAsia="Times New Roman" w:hAnsi="Consolas" w:cs="Times New Roman"/>
+          <w:color w:val="DCDCAA"/>
+          <w:sz w:val="21"/>
+          <w:szCs w:val="21"/>
+        </w:rPr>
+        <w:t>print</w:t>
+      </w:r>
+      <w:r>
+        <w:rPr>
+          <w:rFonts w:ascii="Consolas" w:eastAsia="Times New Roman" w:hAnsi="Consolas" w:cs="Times New Roman"/>
+          <w:color w:val="D4D4D4"/>
+          <w:sz w:val="21"/>
+          <w:szCs w:val="21"/>
+        </w:rPr>
+        <w:t>(</w:t>
+      </w:r>
+      <w:r>
+        <w:rPr>
+          <w:rFonts w:ascii="Consolas" w:eastAsia="Times New Roman" w:hAnsi="Consolas" w:cs="Times New Roman"/>
+          <w:color w:val="569CD6"/>
+          <w:sz w:val="21"/>
+          <w:szCs w:val="21"/>
+        </w:rPr>
+        <w:t>f</w:t>
+      </w:r>
+      <w:r>
+        <w:rPr>
+          <w:rFonts w:ascii="Consolas" w:eastAsia="Times New Roman" w:hAnsi="Consolas" w:cs="Times New Roman"/>
+          <w:color w:val="CE9178"/>
+          <w:sz w:val="21"/>
+          <w:szCs w:val="21"/>
+        </w:rPr>
+        <w:t xml:space="preserve">"Session committed and closed: </w:t>
+      </w:r>
+      <w:r>
+        <w:rPr>
+          <w:rFonts w:ascii="Consolas" w:eastAsia="Times New Roman" w:hAnsi="Consolas" w:cs="Times New Roman"/>
+          <w:color w:val="569CD6"/>
+          <w:sz w:val="21"/>
+          <w:szCs w:val="21"/>
+        </w:rPr>
+        <w:t>{</w:t>
+      </w:r>
+      <w:r>
+        <w:rPr>
+          <w:rFonts w:ascii="Consolas" w:eastAsia="Times New Roman" w:hAnsi="Consolas" w:cs="Times New Roman"/>
+          <w:color w:val="DCDCAA"/>
+          <w:sz w:val="21"/>
+          <w:szCs w:val="21"/>
+        </w:rPr>
+        <w:t>id</w:t>
+      </w:r>
+      <w:r>
+        <w:rPr>
+          <w:rFonts w:ascii="Consolas" w:eastAsia="Times New Roman" w:hAnsi="Consolas" w:cs="Times New Roman"/>
+          <w:color w:val="D4D4D4"/>
+          <w:sz w:val="21"/>
+          <w:szCs w:val="21"/>
+        </w:rPr>
+        <w:t>(</w:t>
+      </w:r>
+      <w:r>
+        <w:rPr>
+          <w:rFonts w:ascii="Consolas" w:eastAsia="Times New Roman" w:hAnsi="Consolas" w:cs="Times New Roman"/>
+          <w:color w:val="9CDCFE"/>
+          <w:sz w:val="21"/>
+          <w:szCs w:val="21"/>
+        </w:rPr>
+        <w:t>session</w:t>
+      </w:r>
+      <w:r>
+        <w:rPr>
+          <w:rFonts w:ascii="Consolas" w:eastAsia="Times New Roman" w:hAnsi="Consolas" w:cs="Times New Roman"/>
+          <w:color w:val="D4D4D4"/>
+          <w:sz w:val="21"/>
+          <w:szCs w:val="21"/>
+        </w:rPr>
+        <w:t>)</w:t>
+      </w:r>
+      <w:r>
+        <w:rPr>
+          <w:rFonts w:ascii="Consolas" w:eastAsia="Times New Roman" w:hAnsi="Consolas" w:cs="Times New Roman"/>
+          <w:color w:val="569CD6"/>
+          <w:sz w:val="21"/>
+          <w:szCs w:val="21"/>
+        </w:rPr>
+        <w:t>}</w:t>
+      </w:r>
+      <w:r>
+        <w:rPr>
+          <w:rFonts w:ascii="Consolas" w:eastAsia="Times New Roman" w:hAnsi="Consolas" w:cs="Times New Roman"/>
+          <w:color w:val="CE9178"/>
+          <w:sz w:val="21"/>
+          <w:szCs w:val="21"/>
+        </w:rPr>
+        <w:t>"</w:t>
+      </w:r>
+      <w:r>
+        <w:rPr>
+          <w:rFonts w:ascii="Consolas" w:eastAsia="Times New Roman" w:hAnsi="Consolas" w:cs="Times New Roman"/>
+          <w:color w:val="D4D4D4"/>
+          <w:sz w:val="21"/>
+          <w:szCs w:val="21"/>
+        </w:rPr>
+        <w:t>)</w:t>
+      </w:r>
+    </w:p>
+    <w:p>
+      <w:pPr>
+        <w:shd w:val="clear" w:color="auto" w:fill="1E1E1E"/>
+        <w:spacing w:after="0" w:line="285" w:lineRule="atLeast"/>
+        <w:rPr>
+          <w:rFonts w:ascii="Consolas" w:eastAsia="Times New Roman" w:hAnsi="Consolas" w:cs="Times New Roman"/>
+          <w:color w:val="D4D4D4"/>
+          <w:sz w:val="21"/>
+          <w:szCs w:val="21"/>
+        </w:rPr>
+      </w:pPr>
+      <w:r>
+        <w:rPr>
+          <w:rFonts w:ascii="Consolas" w:eastAsia="Times New Roman" w:hAnsi="Consolas" w:cs="Times New Roman"/>
+          <w:color w:val="D4D4D4"/>
+          <w:sz w:val="21"/>
+          <w:szCs w:val="21"/>
+        </w:rPr>
+        <w:t xml:space="preserve">    </w:t>
+      </w:r>
+      <w:r>
+        <w:rPr>
+          <w:rFonts w:ascii="Consolas" w:eastAsia="Times New Roman" w:hAnsi="Consolas" w:cs="Times New Roman"/>
+          <w:color w:val="C586C0"/>
+          <w:sz w:val="21"/>
+          <w:szCs w:val="21"/>
+        </w:rPr>
+        <w:t>except</w:t>
+      </w:r>
+      <w:r>
+        <w:rPr>
+          <w:rFonts w:ascii="Consolas" w:eastAsia="Times New Roman" w:hAnsi="Consolas" w:cs="Times New Roman"/>
+          <w:color w:val="D4D4D4"/>
+          <w:sz w:val="21"/>
+          <w:szCs w:val="21"/>
+        </w:rPr>
+        <w:t xml:space="preserve"> </w:t>
+      </w:r>
+      <w:r>
+        <w:rPr>
+          <w:rFonts w:ascii="Consolas" w:eastAsia="Times New Roman" w:hAnsi="Consolas" w:cs="Times New Roman"/>
+          <w:color w:val="4EC9B0"/>
+          <w:sz w:val="21"/>
+          <w:szCs w:val="21"/>
+        </w:rPr>
+        <w:t>Exception</w:t>
+      </w:r>
+      <w:r>
+        <w:rPr>
+          <w:rFonts w:ascii="Consolas" w:eastAsia="Times New Roman" w:hAnsi="Consolas" w:cs="Times New Roman"/>
+          <w:color w:val="D4D4D4"/>
+          <w:sz w:val="21"/>
+          <w:szCs w:val="21"/>
+        </w:rPr>
+        <w:t xml:space="preserve"> </w:t>
+      </w:r>
+      <w:r>
+        <w:rPr>
+          <w:rFonts w:ascii="Consolas" w:eastAsia="Times New Roman" w:hAnsi="Consolas" w:cs="Times New Roman"/>
+          <w:color w:val="C586C0"/>
+          <w:sz w:val="21"/>
+          <w:szCs w:val="21"/>
+        </w:rPr>
+        <w:t>as</w:t>
+      </w:r>
+      <w:r>
+        <w:rPr>
+          <w:rFonts w:ascii="Consolas" w:eastAsia="Times New Roman" w:hAnsi="Consolas" w:cs="Times New Roman"/>
+          <w:color w:val="D4D4D4"/>
+          <w:sz w:val="21"/>
+          <w:szCs w:val="21"/>
+        </w:rPr>
+        <w:t xml:space="preserve"> </w:t>
+      </w:r>
+      <w:r>
+        <w:rPr>
+          <w:rFonts w:ascii="Consolas" w:eastAsia="Times New Roman" w:hAnsi="Consolas" w:cs="Times New Roman"/>
+          <w:color w:val="9CDCFE"/>
+          <w:sz w:val="21"/>
+          <w:szCs w:val="21"/>
+        </w:rPr>
+        <w:t>e</w:t>
+      </w:r>
+      <w:r>
+        <w:rPr>
+          <w:rFonts w:ascii="Consolas" w:eastAsia="Times New Roman" w:hAnsi="Consolas" w:cs="Times New Roman"/>
+          <w:color w:val="D4D4D4"/>
+          <w:sz w:val="21"/>
+          <w:szCs w:val="21"/>
+        </w:rPr>
+        <w:t>:</w:t>
+      </w:r>
+    </w:p>
+    <w:p>
+      <w:pPr>
+        <w:shd w:val="clear" w:color="auto" w:fill="1E1E1E"/>
+        <w:spacing w:after="0" w:line="285" w:lineRule="atLeast"/>
+        <w:rPr>
+          <w:rFonts w:ascii="Consolas" w:eastAsia="Times New Roman" w:hAnsi="Consolas" w:cs="Times New Roman"/>
+          <w:color w:val="D4D4D4"/>
+          <w:sz w:val="21"/>
+          <w:szCs w:val="21"/>
+        </w:rPr>
+      </w:pPr>
+      <w:r>
+        <w:rPr>
+          <w:rFonts w:ascii="Consolas" w:eastAsia="Times New Roman" w:hAnsi="Consolas" w:cs="Times New Roman"/>
+          <w:color w:val="D4D4D4"/>
+          <w:sz w:val="21"/>
+          <w:szCs w:val="21"/>
+        </w:rPr>
+        <w:t xml:space="preserve">        </w:t>
+      </w:r>
+      <w:r>
+        <w:rPr>
+          <w:rFonts w:ascii="Consolas" w:eastAsia="Times New Roman" w:hAnsi="Consolas" w:cs="Times New Roman"/>
+          <w:color w:val="DCDCAA"/>
+          <w:sz w:val="21"/>
+          <w:szCs w:val="21"/>
+        </w:rPr>
+        <w:t>print</w:t>
+      </w:r>
+      <w:r>
+        <w:rPr>
+          <w:rFonts w:ascii="Consolas" w:eastAsia="Times New Roman" w:hAnsi="Consolas" w:cs="Times New Roman"/>
+          <w:color w:val="D4D4D4"/>
+          <w:sz w:val="21"/>
+          <w:szCs w:val="21"/>
+        </w:rPr>
+        <w:t>(</w:t>
+      </w:r>
+      <w:r>
+        <w:rPr>
+          <w:rFonts w:ascii="Consolas" w:eastAsia="Times New Roman" w:hAnsi="Consolas" w:cs="Times New Roman"/>
+          <w:color w:val="569CD6"/>
+          <w:sz w:val="21"/>
+          <w:szCs w:val="21"/>
+        </w:rPr>
+        <w:t>f</w:t>
+      </w:r>
+      <w:r>
+        <w:rPr>
+          <w:rFonts w:ascii="Consolas" w:eastAsia="Times New Roman" w:hAnsi="Consolas" w:cs="Times New Roman"/>
+          <w:color w:val="CE9178"/>
+          <w:sz w:val="21"/>
+          <w:szCs w:val="21"/>
+        </w:rPr>
+        <w:t xml:space="preserve">"Error in session: </w:t>
+      </w:r>
+      <w:r>
+        <w:rPr>
+          <w:rFonts w:ascii="Consolas" w:eastAsia="Times New Roman" w:hAnsi="Consolas" w:cs="Times New Roman"/>
+          <w:color w:val="569CD6"/>
+          <w:sz w:val="21"/>
+          <w:szCs w:val="21"/>
+        </w:rPr>
+        <w:t>{</w:t>
+      </w:r>
+      <w:r>
+        <w:rPr>
+          <w:rFonts w:ascii="Consolas" w:eastAsia="Times New Roman" w:hAnsi="Consolas" w:cs="Times New Roman"/>
+          <w:color w:val="DCDCAA"/>
+          <w:sz w:val="21"/>
+          <w:szCs w:val="21"/>
+        </w:rPr>
+        <w:t>id</w:t>
+      </w:r>
+      <w:r>
+        <w:rPr>
+          <w:rFonts w:ascii="Consolas" w:eastAsia="Times New Roman" w:hAnsi="Consolas" w:cs="Times New Roman"/>
+          <w:color w:val="D4D4D4"/>
+          <w:sz w:val="21"/>
+          <w:szCs w:val="21"/>
+        </w:rPr>
+        <w:t>(</w:t>
+      </w:r>
+      <w:r>
+        <w:rPr>
+          <w:rFonts w:ascii="Consolas" w:eastAsia="Times New Roman" w:hAnsi="Consolas" w:cs="Times New Roman"/>
+          <w:color w:val="9CDCFE"/>
+          <w:sz w:val="21"/>
+          <w:szCs w:val="21"/>
+        </w:rPr>
+        <w:t>session</w:t>
+      </w:r>
+      <w:r>
+        <w:rPr>
+          <w:rFonts w:ascii="Consolas" w:eastAsia="Times New Roman" w:hAnsi="Consolas" w:cs="Times New Roman"/>
+          <w:color w:val="D4D4D4"/>
+          <w:sz w:val="21"/>
+          <w:szCs w:val="21"/>
+        </w:rPr>
+        <w:t>)</w:t>
+      </w:r>
+      <w:r>
+        <w:rPr>
+          <w:rFonts w:ascii="Consolas" w:eastAsia="Times New Roman" w:hAnsi="Consolas" w:cs="Times New Roman"/>
+          <w:color w:val="569CD6"/>
+          <w:sz w:val="21"/>
+          <w:szCs w:val="21"/>
+        </w:rPr>
+        <w:t>}</w:t>
+      </w:r>
+      <w:r>
+        <w:rPr>
+          <w:rFonts w:ascii="Consolas" w:eastAsia="Times New Roman" w:hAnsi="Consolas" w:cs="Times New Roman"/>
+          <w:color w:val="CE9178"/>
+          <w:sz w:val="21"/>
+          <w:szCs w:val="21"/>
+        </w:rPr>
+        <w:t xml:space="preserve">, rolling back: </w:t>
+      </w:r>
+      <w:r>
+        <w:rPr>
+          <w:rFonts w:ascii="Consolas" w:eastAsia="Times New Roman" w:hAnsi="Consolas" w:cs="Times New Roman"/>
+          <w:color w:val="569CD6"/>
+          <w:sz w:val="21"/>
+          <w:szCs w:val="21"/>
+        </w:rPr>
+        <w:t>{</w:t>
+      </w:r>
+      <w:r>
+        <w:rPr>
+          <w:rFonts w:ascii="Consolas" w:eastAsia="Times New Roman" w:hAnsi="Consolas" w:cs="Times New Roman"/>
+          <w:color w:val="4EC9B0"/>
+          <w:sz w:val="21"/>
+          <w:szCs w:val="21"/>
+        </w:rPr>
+        <w:t>str</w:t>
+      </w:r>
+      <w:r>
+        <w:rPr>
+          <w:rFonts w:ascii="Consolas" w:eastAsia="Times New Roman" w:hAnsi="Consolas" w:cs="Times New Roman"/>
+          <w:color w:val="D4D4D4"/>
+          <w:sz w:val="21"/>
+          <w:szCs w:val="21"/>
+        </w:rPr>
+        <w:t>(</w:t>
+      </w:r>
+      <w:r>
+        <w:rPr>
+          <w:rFonts w:ascii="Consolas" w:eastAsia="Times New Roman" w:hAnsi="Consolas" w:cs="Times New Roman"/>
+          <w:color w:val="9CDCFE"/>
+          <w:sz w:val="21"/>
+          <w:szCs w:val="21"/>
+        </w:rPr>
+        <w:t>e</w:t>
+      </w:r>
+      <w:r>
+        <w:rPr>
+          <w:rFonts w:ascii="Consolas" w:eastAsia="Times New Roman" w:hAnsi="Consolas" w:cs="Times New Roman"/>
+          <w:color w:val="D4D4D4"/>
+          <w:sz w:val="21"/>
+          <w:szCs w:val="21"/>
+        </w:rPr>
+        <w:t>)</w:t>
+      </w:r>
+      <w:r>
+        <w:rPr>
+          <w:rFonts w:ascii="Consolas" w:eastAsia="Times New Roman" w:hAnsi="Consolas" w:cs="Times New Roman"/>
+          <w:color w:val="569CD6"/>
+          <w:sz w:val="21"/>
+          <w:szCs w:val="21"/>
+        </w:rPr>
+        <w:t>}</w:t>
+      </w:r>
+      <w:r>
+        <w:rPr>
+          <w:rFonts w:ascii="Consolas" w:eastAsia="Times New Roman" w:hAnsi="Consolas" w:cs="Times New Roman"/>
+          <w:color w:val="CE9178"/>
+          <w:sz w:val="21"/>
+          <w:szCs w:val="21"/>
+        </w:rPr>
+        <w:t>"</w:t>
+      </w:r>
+      <w:r>
+        <w:rPr>
+          <w:rFonts w:ascii="Consolas" w:eastAsia="Times New Roman" w:hAnsi="Consolas" w:cs="Times New Roman"/>
+          <w:color w:val="D4D4D4"/>
+          <w:sz w:val="21"/>
+          <w:szCs w:val="21"/>
+        </w:rPr>
+        <w:t>)</w:t>
+      </w:r>
+    </w:p>
+    <w:p>
+      <w:pPr>
+        <w:shd w:val="clear" w:color="auto" w:fill="1E1E1E"/>
+        <w:spacing w:after="0" w:line="285" w:lineRule="atLeast"/>
+        <w:rPr>
+          <w:rFonts w:ascii="Consolas" w:eastAsia="Times New Roman" w:hAnsi="Consolas" w:cs="Times New Roman"/>
+          <w:color w:val="D4D4D4"/>
+          <w:sz w:val="21"/>
+          <w:szCs w:val="21"/>
+        </w:rPr>
+      </w:pPr>
+      <w:r>
+        <w:rPr>
+          <w:rFonts w:ascii="Consolas" w:eastAsia="Times New Roman" w:hAnsi="Consolas" w:cs="Times New Roman"/>
+          <w:color w:val="D4D4D4"/>
+          <w:sz w:val="21"/>
+          <w:szCs w:val="21"/>
+        </w:rPr>
+        <w:t xml:space="preserve">        </w:t>
+      </w:r>
+      <w:r>
+        <w:rPr>
+          <w:rFonts w:ascii="Consolas" w:eastAsia="Times New Roman" w:hAnsi="Consolas" w:cs="Times New Roman"/>
+          <w:color w:val="C586C0"/>
+          <w:sz w:val="21"/>
+          <w:szCs w:val="21"/>
+        </w:rPr>
+        <w:t>await</w:t>
+      </w:r>
+      <w:r>
+        <w:rPr>
+          <w:rFonts w:ascii="Consolas" w:eastAsia="Times New Roman" w:hAnsi="Consolas" w:cs="Times New Roman"/>
+          <w:color w:val="D4D4D4"/>
+          <w:sz w:val="21"/>
+          <w:szCs w:val="21"/>
+        </w:rPr>
+        <w:t xml:space="preserve"> </w:t>
+      </w:r>
+      <w:r>
+        <w:rPr>
+          <w:rFonts w:ascii="Consolas" w:eastAsia="Times New Roman" w:hAnsi="Consolas" w:cs="Times New Roman"/>
+          <w:color w:val="9CDCFE"/>
+          <w:sz w:val="21"/>
+          <w:szCs w:val="21"/>
+        </w:rPr>
+        <w:t>session</w:t>
+      </w:r>
+      <w:r>
+        <w:rPr>
+          <w:rFonts w:ascii="Consolas" w:eastAsia="Times New Roman" w:hAnsi="Consolas" w:cs="Times New Roman"/>
+          <w:color w:val="D4D4D4"/>
+          <w:sz w:val="21"/>
+          <w:szCs w:val="21"/>
+        </w:rPr>
+        <w:t>.</w:t>
+      </w:r>
+      <w:r>
+        <w:rPr>
+          <w:rFonts w:ascii="Consolas" w:eastAsia="Times New Roman" w:hAnsi="Consolas" w:cs="Times New Roman"/>
+          <w:color w:val="DCDCAA"/>
+          <w:sz w:val="21"/>
+          <w:szCs w:val="21"/>
+        </w:rPr>
+        <w:t>rollback</w:t>
+      </w:r>
+      <w:r>
+        <w:rPr>
+          <w:rFonts w:ascii="Consolas" w:eastAsia="Times New Roman" w:hAnsi="Consolas" w:cs="Times New Roman"/>
+          <w:color w:val="D4D4D4"/>
+          <w:sz w:val="21"/>
+          <w:szCs w:val="21"/>
+        </w:rPr>
+        <w:t>()</w:t>
+      </w:r>
+    </w:p>
+    <w:p>
+      <w:pPr>
+        <w:shd w:val="clear" w:color="auto" w:fill="1E1E1E"/>
+        <w:spacing w:after="0" w:line="285" w:lineRule="atLeast"/>
+        <w:rPr>
+          <w:rFonts w:ascii="Consolas" w:eastAsia="Times New Roman" w:hAnsi="Consolas" w:cs="Times New Roman"/>
+          <w:color w:val="D4D4D4"/>
+          <w:sz w:val="21"/>
+          <w:szCs w:val="21"/>
+        </w:rPr>
+      </w:pPr>
+      <w:r>
+        <w:rPr>
+          <w:rFonts w:ascii="Consolas" w:eastAsia="Times New Roman" w:hAnsi="Consolas" w:cs="Times New Roman"/>
+          <w:color w:val="D4D4D4"/>
+          <w:sz w:val="21"/>
+          <w:szCs w:val="21"/>
+        </w:rPr>
+        <w:t xml:space="preserve">        </w:t>
+      </w:r>
+      <w:r>
+        <w:rPr>
+          <w:rFonts w:ascii="Consolas" w:eastAsia="Times New Roman" w:hAnsi="Consolas" w:cs="Times New Roman"/>
+          <w:color w:val="C586C0"/>
+          <w:sz w:val="21"/>
+          <w:szCs w:val="21"/>
+        </w:rPr>
+        <w:t>raise</w:t>
+      </w:r>
+    </w:p>
+    <w:p>
+      <w:pPr>
+        <w:shd w:val="clear" w:color="auto" w:fill="1E1E1E"/>
+        <w:spacing w:after="0" w:line="285" w:lineRule="atLeast"/>
+        <w:rPr>
+          <w:rFonts w:ascii="Consolas" w:eastAsia="Times New Roman" w:hAnsi="Consolas" w:cs="Times New Roman"/>
+          <w:color w:val="D4D4D4"/>
+          <w:sz w:val="21"/>
+          <w:szCs w:val="21"/>
+        </w:rPr>
+      </w:pPr>
+      <w:r>
+        <w:rPr>
+          <w:rFonts w:ascii="Consolas" w:eastAsia="Times New Roman" w:hAnsi="Consolas" w:cs="Times New Roman"/>
+          <w:color w:val="D4D4D4"/>
+          <w:sz w:val="21"/>
+          <w:szCs w:val="21"/>
+        </w:rPr>
+        <w:t xml:space="preserve">    </w:t>
+      </w:r>
+      <w:r>
+        <w:rPr>
+          <w:rFonts w:ascii="Consolas" w:eastAsia="Times New Roman" w:hAnsi="Consolas" w:cs="Times New Roman"/>
+          <w:color w:val="C586C0"/>
+          <w:sz w:val="21"/>
+          <w:szCs w:val="21"/>
+        </w:rPr>
+        <w:t>finally</w:t>
+      </w:r>
+      <w:r>
+        <w:rPr>
+          <w:rFonts w:ascii="Consolas" w:eastAsia="Times New Roman" w:hAnsi="Consolas" w:cs="Times New Roman"/>
+          <w:color w:val="D4D4D4"/>
+          <w:sz w:val="21"/>
+          <w:szCs w:val="21"/>
+        </w:rPr>
+        <w:t>:</w:t>
+      </w:r>
+    </w:p>
+    <w:p>
+      <w:pPr>
+        <w:shd w:val="clear" w:color="auto" w:fill="1E1E1E"/>
+        <w:spacing w:after="0" w:line="285" w:lineRule="atLeast"/>
+        <w:rPr>
+          <w:rFonts w:ascii="Consolas" w:eastAsia="Times New Roman" w:hAnsi="Consolas" w:cs="Times New Roman"/>
+          <w:color w:val="D4D4D4"/>
+          <w:sz w:val="21"/>
+          <w:szCs w:val="21"/>
+        </w:rPr>
+      </w:pPr>
+      <w:r>
+        <w:rPr>
+          <w:rFonts w:ascii="Consolas" w:eastAsia="Times New Roman" w:hAnsi="Consolas" w:cs="Times New Roman"/>
+          <w:color w:val="D4D4D4"/>
+          <w:sz w:val="21"/>
+          <w:szCs w:val="21"/>
+        </w:rPr>
+        <w:t xml:space="preserve">        </w:t>
+      </w:r>
+      <w:r>
+        <w:rPr>
+          <w:rFonts w:ascii="Consolas" w:eastAsia="Times New Roman" w:hAnsi="Consolas" w:cs="Times New Roman"/>
+          <w:color w:val="C586C0"/>
+          <w:sz w:val="21"/>
+          <w:szCs w:val="21"/>
+        </w:rPr>
+        <w:t>await</w:t>
+      </w:r>
+      <w:r>
+        <w:rPr>
+          <w:rFonts w:ascii="Consolas" w:eastAsia="Times New Roman" w:hAnsi="Consolas" w:cs="Times New Roman"/>
+          <w:color w:val="D4D4D4"/>
+          <w:sz w:val="21"/>
+          <w:szCs w:val="21"/>
+        </w:rPr>
+        <w:t xml:space="preserve"> </w:t>
+      </w:r>
+      <w:r>
+        <w:rPr>
+          <w:rFonts w:ascii="Consolas" w:eastAsia="Times New Roman" w:hAnsi="Consolas" w:cs="Times New Roman"/>
+          <w:color w:val="9CDCFE"/>
+          <w:sz w:val="21"/>
+          <w:szCs w:val="21"/>
+        </w:rPr>
+        <w:t>session</w:t>
+      </w:r>
+      <w:r>
+        <w:rPr>
+          <w:rFonts w:ascii="Consolas" w:eastAsia="Times New Roman" w:hAnsi="Consolas" w:cs="Times New Roman"/>
+          <w:color w:val="D4D4D4"/>
+          <w:sz w:val="21"/>
+          <w:szCs w:val="21"/>
+        </w:rPr>
+        <w:t>.</w:t>
+      </w:r>
+      <w:r>
+        <w:rPr>
+          <w:rFonts w:ascii="Consolas" w:eastAsia="Times New Roman" w:hAnsi="Consolas" w:cs="Times New Roman"/>
+          <w:color w:val="DCDCAA"/>
+          <w:sz w:val="21"/>
+          <w:szCs w:val="21"/>
+        </w:rPr>
+        <w:t>close</w:t>
+      </w:r>
+      <w:r>
+        <w:rPr>
+          <w:rFonts w:ascii="Consolas" w:eastAsia="Times New Roman" w:hAnsi="Consolas" w:cs="Times New Roman"/>
+          <w:color w:val="D4D4D4"/>
+          <w:sz w:val="21"/>
+          <w:szCs w:val="21"/>
+        </w:rPr>
+        <w:t>()</w:t>
+      </w:r>
+    </w:p>
+    <w:p>
+      <w:pPr>
+        <w:shd w:val="clear" w:color="auto" w:fill="1E1E1E"/>
+        <w:spacing w:after="0" w:line="285" w:lineRule="atLeast"/>
+        <w:rPr>
+          <w:rFonts w:ascii="Consolas" w:eastAsia="Times New Roman" w:hAnsi="Consolas" w:cs="Times New Roman"/>
+          <w:color w:val="D4D4D4"/>
+          <w:sz w:val="21"/>
+          <w:szCs w:val="21"/>
+        </w:rPr>
+      </w:pPr>
+      <w:r>
+        <w:rPr>
+          <w:rFonts w:ascii="Consolas" w:eastAsia="Times New Roman" w:hAnsi="Consolas" w:cs="Times New Roman"/>
+          <w:color w:val="D4D4D4"/>
+          <w:sz w:val="21"/>
+          <w:szCs w:val="21"/>
+        </w:rPr>
+        <w:t xml:space="preserve">        </w:t>
+      </w:r>
+      <w:r>
+        <w:rPr>
+          <w:rFonts w:ascii="Consolas" w:eastAsia="Times New Roman" w:hAnsi="Consolas" w:cs="Times New Roman"/>
+          <w:color w:val="DCDCAA"/>
+          <w:sz w:val="21"/>
+          <w:szCs w:val="21"/>
+        </w:rPr>
+        <w:t>print</w:t>
+      </w:r>
+      <w:r>
+        <w:rPr>
+          <w:rFonts w:ascii="Consolas" w:eastAsia="Times New Roman" w:hAnsi="Consolas" w:cs="Times New Roman"/>
+          <w:color w:val="D4D4D4"/>
+          <w:sz w:val="21"/>
+          <w:szCs w:val="21"/>
+        </w:rPr>
+        <w:t>(</w:t>
+      </w:r>
+      <w:r>
+        <w:rPr>
+          <w:rFonts w:ascii="Consolas" w:eastAsia="Times New Roman" w:hAnsi="Consolas" w:cs="Times New Roman"/>
+          <w:color w:val="569CD6"/>
+          <w:sz w:val="21"/>
+          <w:szCs w:val="21"/>
+        </w:rPr>
+        <w:t>f</w:t>
+      </w:r>
+      <w:r>
+        <w:rPr>
+          <w:rFonts w:ascii="Consolas" w:eastAsia="Times New Roman" w:hAnsi="Consolas" w:cs="Times New Roman"/>
+          <w:color w:val="CE9178"/>
+          <w:sz w:val="21"/>
+          <w:szCs w:val="21"/>
+        </w:rPr>
+        <w:t xml:space="preserve">"Session explicitly closed: </w:t>
+      </w:r>
+      <w:r>
+        <w:rPr>
+          <w:rFonts w:ascii="Consolas" w:eastAsia="Times New Roman" w:hAnsi="Consolas" w:cs="Times New Roman"/>
+          <w:color w:val="569CD6"/>
+          <w:sz w:val="21"/>
+          <w:szCs w:val="21"/>
+        </w:rPr>
+        <w:t>{</w:t>
+      </w:r>
+      <w:r>
+        <w:rPr>
+          <w:rFonts w:ascii="Consolas" w:eastAsia="Times New Roman" w:hAnsi="Consolas" w:cs="Times New Roman"/>
+          <w:color w:val="DCDCAA"/>
+          <w:sz w:val="21"/>
+          <w:szCs w:val="21"/>
+        </w:rPr>
+        <w:t>id</w:t>
+      </w:r>
+      <w:r>
+        <w:rPr>
+          <w:rFonts w:ascii="Consolas" w:eastAsia="Times New Roman" w:hAnsi="Consolas" w:cs="Times New Roman"/>
+          <w:color w:val="D4D4D4"/>
+          <w:sz w:val="21"/>
+          <w:szCs w:val="21"/>
+        </w:rPr>
+        <w:t>(</w:t>
+      </w:r>
+      <w:r>
+        <w:rPr>
+          <w:rFonts w:ascii="Consolas" w:eastAsia="Times New Roman" w:hAnsi="Consolas" w:cs="Times New Roman"/>
+          <w:color w:val="9CDCFE"/>
+          <w:sz w:val="21"/>
+          <w:szCs w:val="21"/>
+        </w:rPr>
+        <w:t>session</w:t>
+      </w:r>
+      <w:r>
+        <w:rPr>
+          <w:rFonts w:ascii="Consolas" w:eastAsia="Times New Roman" w:hAnsi="Consolas" w:cs="Times New Roman"/>
+          <w:color w:val="D4D4D4"/>
+          <w:sz w:val="21"/>
+          <w:szCs w:val="21"/>
+        </w:rPr>
+        <w:t>)</w:t>
+      </w:r>
+      <w:r>
+        <w:rPr>
+          <w:rFonts w:ascii="Consolas" w:eastAsia="Times New Roman" w:hAnsi="Consolas" w:cs="Times New Roman"/>
+          <w:color w:val="569CD6"/>
+          <w:sz w:val="21"/>
+          <w:szCs w:val="21"/>
+        </w:rPr>
+        <w:t>}</w:t>
+      </w:r>
+      <w:r>
+        <w:rPr>
+          <w:rFonts w:ascii="Consolas" w:eastAsia="Times New Roman" w:hAnsi="Consolas" w:cs="Times New Roman"/>
+          <w:color w:val="CE9178"/>
+          <w:sz w:val="21"/>
+          <w:szCs w:val="21"/>
+        </w:rPr>
+        <w:t>"</w:t>
+      </w:r>
+      <w:r>
+        <w:rPr>
+          <w:rFonts w:ascii="Consolas" w:eastAsia="Times New Roman" w:hAnsi="Consolas" w:cs="Times New Roman"/>
+          <w:color w:val="D4D4D4"/>
+          <w:sz w:val="21"/>
+          <w:szCs w:val="21"/>
+        </w:rPr>
+        <w:t>)</w:t>
+      </w:r>
+    </w:p>
+    <w:p>
+      <w:pPr>
+        <w:shd w:val="clear" w:color="auto" w:fill="1E1E1E"/>
+        <w:spacing w:after="0" w:line="285" w:lineRule="atLeast"/>
+        <w:rPr>
+          <w:rFonts w:ascii="Consolas" w:eastAsia="Times New Roman" w:hAnsi="Consolas" w:cs="Times New Roman"/>
+          <w:color w:val="D4D4D4"/>
+          <w:sz w:val="21"/>
+          <w:szCs w:val="21"/>
+        </w:rPr>
+      </w:pPr>
+      <w:r>
+        <w:rPr>
+          <w:rFonts w:ascii="Consolas" w:eastAsia="Times New Roman" w:hAnsi="Consolas" w:cs="Times New Roman"/>
+          <w:color w:val="D4D4D4"/>
+          <w:sz w:val="21"/>
+          <w:szCs w:val="21"/>
+        </w:rPr>
+        <w:t xml:space="preserve">        </w:t>
+      </w:r>
+    </w:p>
+    <w:p>
+      <w:pPr>
+        <w:shd w:val="clear" w:color="auto" w:fill="1E1E1E"/>
+        <w:spacing w:after="0" w:line="285" w:lineRule="atLeast"/>
+        <w:rPr>
+          <w:rFonts w:ascii="Consolas" w:eastAsia="Times New Roman" w:hAnsi="Consolas" w:cs="Times New Roman"/>
+          <w:color w:val="D4D4D4"/>
+          <w:sz w:val="21"/>
+          <w:szCs w:val="21"/>
+        </w:rPr>
+      </w:pPr>
+      <w:r>
+        <w:rPr>
+          <w:rFonts w:ascii="Consolas" w:eastAsia="Times New Roman" w:hAnsi="Consolas" w:cs="Times New Roman"/>
+          <w:color w:val="D4D4D4"/>
+          <w:sz w:val="21"/>
+          <w:szCs w:val="21"/>
+        </w:rPr>
+        <w:t xml:space="preserve">        </w:t>
+      </w:r>
+    </w:p>
+    <w:p>
+      <w:pPr>
+        <w:shd w:val="clear" w:color="auto" w:fill="1E1E1E"/>
+        <w:spacing w:after="0" w:line="285" w:lineRule="atLeast"/>
+        <w:rPr>
+          <w:rFonts w:ascii="Consolas" w:eastAsia="Times New Roman" w:hAnsi="Consolas" w:cs="Times New Roman"/>
+          <w:color w:val="D4D4D4"/>
+          <w:sz w:val="21"/>
+          <w:szCs w:val="21"/>
+        </w:rPr>
+      </w:pPr>
+      <w:r>
+        <w:rPr>
+          <w:rFonts w:ascii="Consolas" w:eastAsia="Times New Roman" w:hAnsi="Consolas" w:cs="Times New Roman"/>
+          <w:color w:val="4EC9B0"/>
+          <w:sz w:val="21"/>
+          <w:szCs w:val="21"/>
+        </w:rPr>
+        <w:lastRenderedPageBreak/>
+        <w:t>SessionDep</w:t>
+      </w:r>
+      <w:r>
+        <w:rPr>
+          <w:rFonts w:ascii="Consolas" w:eastAsia="Times New Roman" w:hAnsi="Consolas" w:cs="Times New Roman"/>
+          <w:color w:val="D4D4D4"/>
+          <w:sz w:val="21"/>
+          <w:szCs w:val="21"/>
+        </w:rPr>
+        <w:t xml:space="preserve"> = </w:t>
+      </w:r>
+      <w:r>
+        <w:rPr>
+          <w:rFonts w:ascii="Consolas" w:eastAsia="Times New Roman" w:hAnsi="Consolas" w:cs="Times New Roman"/>
+          <w:color w:val="4EC9B0"/>
+          <w:sz w:val="21"/>
+          <w:szCs w:val="21"/>
+        </w:rPr>
+        <w:t>Annotated</w:t>
+      </w:r>
+      <w:r>
+        <w:rPr>
+          <w:rFonts w:ascii="Consolas" w:eastAsia="Times New Roman" w:hAnsi="Consolas" w:cs="Times New Roman"/>
+          <w:color w:val="D4D4D4"/>
+          <w:sz w:val="21"/>
+          <w:szCs w:val="21"/>
+        </w:rPr>
+        <w:t>[</w:t>
+      </w:r>
+      <w:r>
+        <w:rPr>
+          <w:rFonts w:ascii="Consolas" w:eastAsia="Times New Roman" w:hAnsi="Consolas" w:cs="Times New Roman"/>
+          <w:color w:val="4EC9B0"/>
+          <w:sz w:val="21"/>
+          <w:szCs w:val="21"/>
+        </w:rPr>
+        <w:t>AsyncSession</w:t>
+      </w:r>
+      <w:r>
+        <w:rPr>
+          <w:rFonts w:ascii="Consolas" w:eastAsia="Times New Roman" w:hAnsi="Consolas" w:cs="Times New Roman"/>
+          <w:color w:val="D4D4D4"/>
+          <w:sz w:val="21"/>
+          <w:szCs w:val="21"/>
+        </w:rPr>
+        <w:t>,</w:t>
+      </w:r>
+      <w:r>
+        <w:rPr>
+          <w:rFonts w:ascii="Consolas" w:eastAsia="Times New Roman" w:hAnsi="Consolas" w:cs="Times New Roman"/>
+          <w:color w:val="DCDCAA"/>
+          <w:sz w:val="21"/>
+          <w:szCs w:val="21"/>
+        </w:rPr>
+        <w:t>Depends</w:t>
+      </w:r>
+      <w:r>
+        <w:rPr>
+          <w:rFonts w:ascii="Consolas" w:eastAsia="Times New Roman" w:hAnsi="Consolas" w:cs="Times New Roman"/>
+          <w:color w:val="D4D4D4"/>
+          <w:sz w:val="21"/>
+          <w:szCs w:val="21"/>
+        </w:rPr>
+        <w:t>(</w:t>
+      </w:r>
+      <w:r>
+        <w:rPr>
+          <w:rFonts w:ascii="Consolas" w:eastAsia="Times New Roman" w:hAnsi="Consolas" w:cs="Times New Roman"/>
+          <w:color w:val="DCDCAA"/>
+          <w:sz w:val="21"/>
+          <w:szCs w:val="21"/>
+        </w:rPr>
+        <w:t>get_db</w:t>
+      </w:r>
+      <w:r>
+        <w:rPr>
+          <w:rFonts w:ascii="Consolas" w:eastAsia="Times New Roman" w:hAnsi="Consolas" w:cs="Times New Roman"/>
+          <w:color w:val="D4D4D4"/>
+          <w:sz w:val="21"/>
+          <w:szCs w:val="21"/>
+        </w:rPr>
+        <w:t>)]</w:t>
+      </w:r>
+    </w:p>
+    <w:p>
+      <w:pPr>
+        <w:shd w:val="clear" w:color="auto" w:fill="1E1E1E"/>
+        <w:spacing w:after="0" w:line="285" w:lineRule="atLeast"/>
+        <w:rPr>
+          <w:rFonts w:ascii="Consolas" w:eastAsia="Times New Roman" w:hAnsi="Consolas" w:cs="Times New Roman"/>
+          <w:color w:val="D4D4D4"/>
+          <w:sz w:val="21"/>
+          <w:szCs w:val="21"/>
+        </w:rPr>
+      </w:pPr>
+    </w:p>
+    <w:p/>
+    <w:p>
+      <w:r>
         <w:pict>
-          <v:rect id="_x0000_i1063" style="width:0;height:1.5pt" o:hralign="center" o:hrstd="t" o:hr="t" fillcolor="#a0a0a0" stroked="f"/>
+          <v:rect id="_x0000_i1039" style="width:0;height:1.5pt" o:hralign="center" o:hrstd="t" o:hr="t" fillcolor="#a0a0a0" stroked="f"/>
         </w:pict>
       </w:r>
     </w:p>
@@ -14886,7 +17462,7 @@
     <w:p>
       <w:r>
         <w:pict>
-          <v:rect id="_x0000_i1064" style="width:0;height:1.5pt" o:hralign="center" o:hrstd="t" o:hr="t" fillcolor="#a0a0a0" stroked="f"/>
+          <v:rect id="_x0000_i1040" style="width:0;height:1.5pt" o:hralign="center" o:hrstd="t" o:hr="t" fillcolor="#a0a0a0" stroked="f"/>
         </w:pict>
       </w:r>
     </w:p>
@@ -15045,7 +17621,7 @@
       <w:r>
         <w:lastRenderedPageBreak/>
         <w:pict>
-          <v:rect id="_x0000_i1065" style="width:0;height:1.5pt" o:hralign="center" o:hrstd="t" o:hr="t" fillcolor="#a0a0a0" stroked="f"/>
+          <v:rect id="_x0000_i1041" style="width:0;height:1.5pt" o:hralign="center" o:hrstd="t" o:hr="t" fillcolor="#a0a0a0" stroked="f"/>
         </w:pict>
       </w:r>
     </w:p>
@@ -15719,7 +18295,7 @@
     <w:p>
       <w:r>
         <w:pict>
-          <v:rect id="_x0000_i1066" style="width:0;height:1.5pt" o:hralign="center" o:hrstd="t" o:hr="t" fillcolor="#a0a0a0" stroked="f"/>
+          <v:rect id="_x0000_i1042" style="width:0;height:1.5pt" o:hralign="center" o:hrstd="t" o:hr="t" fillcolor="#a0a0a0" stroked="f"/>
         </w:pict>
       </w:r>
     </w:p>
@@ -16043,7 +18619,7 @@
     <w:p>
       <w:r>
         <w:pict>
-          <v:rect id="_x0000_i1067" style="width:0;height:1.5pt" o:hralign="center" o:hrstd="t" o:hr="t" fillcolor="#a0a0a0" stroked="f"/>
+          <v:rect id="_x0000_i1043" style="width:0;height:1.5pt" o:hralign="center" o:hrstd="t" o:hr="t" fillcolor="#a0a0a0" stroked="f"/>
         </w:pict>
       </w:r>
     </w:p>
@@ -16385,7 +18961,7 @@
     <w:p>
       <w:r>
         <w:pict>
-          <v:rect id="_x0000_i1068" style="width:0;height:1.5pt" o:hralign="center" o:hrstd="t" o:hr="t" fillcolor="#a0a0a0" stroked="f"/>
+          <v:rect id="_x0000_i1044" style="width:0;height:1.5pt" o:hralign="center" o:hrstd="t" o:hr="t" fillcolor="#a0a0a0" stroked="f"/>
         </w:pict>
       </w:r>
     </w:p>
@@ -16655,7 +19231,7 @@
     <w:p>
       <w:r>
         <w:pict>
-          <v:rect id="_x0000_i1069" style="width:0;height:1.5pt" o:hralign="center" o:hrstd="t" o:hr="t" fillcolor="#a0a0a0" stroked="f"/>
+          <v:rect id="_x0000_i1045" style="width:0;height:1.5pt" o:hralign="center" o:hrstd="t" o:hr="t" fillcolor="#a0a0a0" stroked="f"/>
         </w:pict>
       </w:r>
     </w:p>
@@ -17052,7 +19628,7 @@
     <w:p>
       <w:r>
         <w:pict>
-          <v:rect id="_x0000_i1070" style="width:0;height:1.5pt" o:hralign="center" o:hrstd="t" o:hr="t" fillcolor="#a0a0a0" stroked="f"/>
+          <v:rect id="_x0000_i1046" style="width:0;height:1.5pt" o:hralign="center" o:hrstd="t" o:hr="t" fillcolor="#a0a0a0" stroked="f"/>
         </w:pict>
       </w:r>
     </w:p>
@@ -17448,7 +20024,7 @@
     <w:p>
       <w:r>
         <w:pict>
-          <v:rect id="_x0000_i1071" style="width:0;height:1.5pt" o:hralign="center" o:hrstd="t" o:hr="t" fillcolor="#a0a0a0" stroked="f"/>
+          <v:rect id="_x0000_i1047" style="width:0;height:1.5pt" o:hralign="center" o:hrstd="t" o:hr="t" fillcolor="#a0a0a0" stroked="f"/>
         </w:pict>
       </w:r>
     </w:p>
@@ -17772,7 +20348,7 @@
     <w:p>
       <w:r>
         <w:pict>
-          <v:rect id="_x0000_i1072" style="width:0;height:1.5pt" o:hralign="center" o:hrstd="t" o:hr="t" fillcolor="#a0a0a0" stroked="f"/>
+          <v:rect id="_x0000_i1048" style="width:0;height:1.5pt" o:hralign="center" o:hrstd="t" o:hr="t" fillcolor="#a0a0a0" stroked="f"/>
         </w:pict>
       </w:r>
     </w:p>
@@ -17875,7 +20451,7 @@
     <w:p>
       <w:r>
         <w:pict>
-          <v:rect id="_x0000_i1073" style="width:0;height:1.5pt" o:hralign="center" o:hrstd="t" o:hr="t" fillcolor="#a0a0a0" stroked="f"/>
+          <v:rect id="_x0000_i1049" style="width:0;height:1.5pt" o:hralign="center" o:hrstd="t" o:hr="t" fillcolor="#a0a0a0" stroked="f"/>
         </w:pict>
       </w:r>
     </w:p>
@@ -18454,7 +21030,7 @@
     <w:p>
       <w:r>
         <w:pict>
-          <v:rect id="_x0000_i1074" style="width:0;height:1.5pt" o:hralign="center" o:hrstd="t" o:hr="t" fillcolor="#a0a0a0" stroked="f"/>
+          <v:rect id="_x0000_i1050" style="width:0;height:1.5pt" o:hralign="center" o:hrstd="t" o:hr="t" fillcolor="#a0a0a0" stroked="f"/>
         </w:pict>
       </w:r>
     </w:p>
@@ -19030,7 +21606,7 @@
     <w:p>
       <w:r>
         <w:pict>
-          <v:rect id="_x0000_i1075" style="width:0;height:1.5pt" o:hralign="center" o:hrstd="t" o:hr="t" fillcolor="#a0a0a0" stroked="f"/>
+          <v:rect id="_x0000_i1051" style="width:0;height:1.5pt" o:hralign="center" o:hrstd="t" o:hr="t" fillcolor="#a0a0a0" stroked="f"/>
         </w:pict>
       </w:r>
     </w:p>
@@ -19459,7 +22035,7 @@
     <w:p>
       <w:r>
         <w:pict>
-          <v:rect id="_x0000_i1076" style="width:0;height:1.5pt" o:hralign="center" o:hrstd="t" o:hr="t" fillcolor="#a0a0a0" stroked="f"/>
+          <v:rect id="_x0000_i1052" style="width:0;height:1.5pt" o:hralign="center" o:hrstd="t" o:hr="t" fillcolor="#a0a0a0" stroked="f"/>
         </w:pict>
       </w:r>
     </w:p>
@@ -19687,7 +22263,7 @@
     <w:p>
       <w:r>
         <w:pict>
-          <v:rect id="_x0000_i1077" style="width:0;height:1.5pt" o:hralign="center" o:hrstd="t" o:hr="t" fillcolor="#a0a0a0" stroked="f"/>
+          <v:rect id="_x0000_i1053" style="width:0;height:1.5pt" o:hralign="center" o:hrstd="t" o:hr="t" fillcolor="#a0a0a0" stroked="f"/>
         </w:pict>
       </w:r>
     </w:p>
@@ -20309,7 +22885,7 @@
     <w:p>
       <w:r>
         <w:pict>
-          <v:rect id="_x0000_i1078" style="width:0;height:1.5pt" o:hralign="center" o:hrstd="t" o:hr="t" fillcolor="#a0a0a0" stroked="f"/>
+          <v:rect id="_x0000_i1054" style="width:0;height:1.5pt" o:hralign="center" o:hrstd="t" o:hr="t" fillcolor="#a0a0a0" stroked="f"/>
         </w:pict>
       </w:r>
     </w:p>
@@ -21128,7 +23704,7 @@
     <w:p>
       <w:r>
         <w:pict>
-          <v:rect id="_x0000_i1079" style="width:0;height:1.5pt" o:hralign="center" o:hrstd="t" o:hr="t" fillcolor="#a0a0a0" stroked="f"/>
+          <v:rect id="_x0000_i1055" style="width:0;height:1.5pt" o:hralign="center" o:hrstd="t" o:hr="t" fillcolor="#a0a0a0" stroked="f"/>
         </w:pict>
       </w:r>
     </w:p>
@@ -21708,7 +24284,7 @@
     <w:p>
       <w:r>
         <w:pict>
-          <v:rect id="_x0000_i1080" style="width:0;height:1.5pt" o:hralign="center" o:hrstd="t" o:hr="t" fillcolor="#a0a0a0" stroked="f"/>
+          <v:rect id="_x0000_i1056" style="width:0;height:1.5pt" o:hralign="center" o:hrstd="t" o:hr="t" fillcolor="#a0a0a0" stroked="f"/>
         </w:pict>
       </w:r>
     </w:p>
@@ -21937,7 +24513,7 @@
     <w:p>
       <w:r>
         <w:pict>
-          <v:rect id="_x0000_i1081" style="width:0;height:1.5pt" o:hralign="center" o:hrstd="t" o:hr="t" fillcolor="#a0a0a0" stroked="f"/>
+          <v:rect id="_x0000_i1057" style="width:0;height:1.5pt" o:hralign="center" o:hrstd="t" o:hr="t" fillcolor="#a0a0a0" stroked="f"/>
         </w:pict>
       </w:r>
     </w:p>
@@ -22245,7 +24821,7 @@
     <w:p>
       <w:r>
         <w:pict>
-          <v:rect id="_x0000_i1082" style="width:0;height:1.5pt" o:hralign="center" o:hrstd="t" o:hr="t" fillcolor="#a0a0a0" stroked="f"/>
+          <v:rect id="_x0000_i1058" style="width:0;height:1.5pt" o:hralign="center" o:hrstd="t" o:hr="t" fillcolor="#a0a0a0" stroked="f"/>
         </w:pict>
       </w:r>
     </w:p>
@@ -22329,7 +24905,7 @@
     <w:p>
       <w:r>
         <w:pict>
-          <v:rect id="_x0000_i1083" style="width:0;height:1.5pt" o:hralign="center" o:hrstd="t" o:hr="t" fillcolor="#a0a0a0" stroked="f"/>
+          <v:rect id="_x0000_i1059" style="width:0;height:1.5pt" o:hralign="center" o:hrstd="t" o:hr="t" fillcolor="#a0a0a0" stroked="f"/>
         </w:pict>
       </w:r>
     </w:p>
@@ -22409,7 +24985,7 @@
     <w:p>
       <w:r>
         <w:pict>
-          <v:rect id="_x0000_i1084" style="width:0;height:1.5pt" o:hralign="center" o:hrstd="t" o:hr="t" fillcolor="#a0a0a0" stroked="f"/>
+          <v:rect id="_x0000_i1060" style="width:0;height:1.5pt" o:hralign="center" o:hrstd="t" o:hr="t" fillcolor="#a0a0a0" stroked="f"/>
         </w:pict>
       </w:r>
     </w:p>

</xml_diff>